<commit_message>
Update pre03 evaluation slides and thesis outlines
</commit_message>
<xml_diff>
--- a/Source/Proposal/Thesis Outline Detail.docx
+++ b/Source/Proposal/Thesis Outline Detail.docx
@@ -43,7 +43,7 @@
           <w:sz w:val="22"/>
           <w:szCs w:val="22"/>
         </w:rPr>
-        <w:t xml:space="preserve">Kaihao Wang · 2026-10-21</w:t>
+        <w:t xml:space="preserve">Kaihao Wang · 2026-10-28</w:t>
       </w:r>
     </w:p>
     <w:p>
@@ -59,46 +59,72 @@
         <w:spacing w:after="100"/>
       </w:pPr>
       <w:r>
-        <w:t xml:space="preserve">本框架基于当前项目进度（ARK-V1/V1.1 基线、GTSQA / GTSQA-UA / CR-LT-KGQA 开发实验、EM_and_GG 失败分析）整理，相比原 7 章提纲做了以下调整：</w:t>
-      </w:r>
-    </w:p>
-    <w:p>
-      <w:pPr>
-        <w:pStyle w:val="ListParagraph"/>
-        <w:numPr>
-          <w:ilvl w:val="0"/>
-          <w:numId w:val="2"/>
-        </w:numPr>
-        <w:spacing w:after="60"/>
-      </w:pPr>
-      <w:r>
-        <w:t xml:space="preserve">按新标题（导师修订）重组：评测框架单独成章，基线诊断与 ARK-V2 正式评测分开。</w:t>
-      </w:r>
-    </w:p>
-    <w:p>
-      <w:pPr>
-        <w:pStyle w:val="ListParagraph"/>
-        <w:numPr>
-          <w:ilvl w:val="0"/>
-          <w:numId w:val="2"/>
-        </w:numPr>
-        <w:spacing w:after="60"/>
-      </w:pPr>
-      <w:r>
-        <w:t xml:space="preserve">原第 1、2 章合并为不分小节的 Introduction，背景知识和文献综述写在其中；论文共 7 章。</w:t>
-      </w:r>
-    </w:p>
-    <w:p>
-      <w:pPr>
-        <w:pStyle w:val="ListParagraph"/>
-        <w:numPr>
-          <w:ilvl w:val="0"/>
-          <w:numId w:val="2"/>
-        </w:numPr>
-        <w:spacing w:after="60"/>
-      </w:pPr>
-      <w:r>
-        <w:t xml:space="preserve">贡献不写在 Introduction，放到第 7 章 Conclusion。</w:t>
+        <w:t xml:space="preserve">本框架基于当前项目进度（ARK-V1/V1.1 基线、GTSQA / GTSQA-UA / CR-LT-KGQA 开发实验、EM_and_GG 失败分析），并按导师给出的论文结构整理：</w:t>
+      </w:r>
+    </w:p>
+    <w:p>
+      <w:pPr>
+        <w:pStyle w:val="ListParagraph"/>
+        <w:numPr>
+          <w:ilvl w:val="0"/>
+          <w:numId w:val="2"/>
+        </w:numPr>
+        <w:spacing w:after="60"/>
+      </w:pPr>
+      <w:r>
+        <w:t xml:space="preserve">Introduction 按导师给的三节写：Problem Statement、Objectives、Approach and Thesis Structure。</w:t>
+      </w:r>
+    </w:p>
+    <w:p>
+      <w:pPr>
+        <w:pStyle w:val="ListParagraph"/>
+        <w:numPr>
+          <w:ilvl w:val="0"/>
+          <w:numId w:val="2"/>
+        </w:numPr>
+        <w:spacing w:after="60"/>
+      </w:pPr>
+      <w:r>
+        <w:t xml:space="preserve">背景知识和相关工作单独成第 2 章，并在章末汇总研究空白。</w:t>
+      </w:r>
+    </w:p>
+    <w:p>
+      <w:pPr>
+        <w:pStyle w:val="ListParagraph"/>
+        <w:numPr>
+          <w:ilvl w:val="0"/>
+          <w:numId w:val="2"/>
+        </w:numPr>
+        <w:spacing w:after="60"/>
+      </w:pPr>
+      <w:r>
+        <w:t xml:space="preserve">主体为三章：评测框架（第 3 章）→ 基线分析与 ARK-V2 设计（第 4 章）→ 评测（第 5 章）。Conclusion（第 6 章）和 Future Work（第 7 章）分开。</w:t>
+      </w:r>
+    </w:p>
+    <w:p>
+      <w:pPr>
+        <w:pStyle w:val="ListParagraph"/>
+        <w:numPr>
+          <w:ilvl w:val="0"/>
+          <w:numId w:val="2"/>
+        </w:numPr>
+        <w:spacing w:after="60"/>
+      </w:pPr>
+      <w:r>
+        <w:t xml:space="preserve">小节标题尽量简短，只在两个概念确实并列时用 and。</w:t>
+      </w:r>
+    </w:p>
+    <w:p>
+      <w:pPr>
+        <w:pStyle w:val="ListParagraph"/>
+        <w:numPr>
+          <w:ilvl w:val="0"/>
+          <w:numId w:val="2"/>
+        </w:numPr>
+        <w:spacing w:after="60"/>
+      </w:pPr>
+      <w:r>
+        <w:t xml:space="preserve">贡献不写在 Introduction，放到 6.2。</w:t>
       </w:r>
     </w:p>
     <w:p>
@@ -124,7 +150,7 @@
         <w:spacing w:after="60"/>
       </w:pPr>
       <w:r>
-        <w:t xml:space="preserve">第 5 章不固定具体模块，按第 4 章推出的需求组织；最终保留哪些改进，根据剩余时间、实现难度和实际效果决定。</w:t>
+        <w:t xml:space="preserve">4.3 不固定具体组件，按 4.2.3 推出的需求组织；最终保留哪些改进，根据剩余时间、实现难度和实际效果决定。</w:t>
       </w:r>
     </w:p>
     <w:p>
@@ -150,7 +176,20 @@
         <w:spacing w:after="60"/>
       </w:pPr>
       <w:r>
-        <w:t xml:space="preserve">第 4 章中 ARK-V1.1 的开发集结果定位为诊断用的初步实验，正式结论只出现在第 6 章。</w:t>
+        <w:t xml:space="preserve">4.2 中 ARK-V1.1 的开发集结果定位为诊断用的初步实验，正式结论只出现在第 5 章。</w:t>
+      </w:r>
+    </w:p>
+    <w:p>
+      <w:pPr>
+        <w:pStyle w:val="ListParagraph"/>
+        <w:numPr>
+          <w:ilvl w:val="0"/>
+          <w:numId w:val="2"/>
+        </w:numPr>
+        <w:spacing w:after="60"/>
+      </w:pPr>
+      <w:r>
+        <w:t xml:space="preserve">正文只讲方法和思路，输出接口字段、实验配置、Prompt 等细节放附录。</w:t>
       </w:r>
     </w:p>
     <w:p>
@@ -166,7 +205,7 @@
         <w:pStyle w:val="Heading1"/>
       </w:pPr>
       <w:r>
-        <w:t xml:space="preserve">1 Introduction</w:t>
+        <w:t xml:space="preserve">前置页（Front Matter，不编号）</w:t>
       </w:r>
     </w:p>
     <w:p>
@@ -174,211 +213,100 @@
         <w:spacing w:after="100"/>
       </w:pPr>
       <w:r>
-        <w:t xml:space="preserve">本章不分小节，按以下顺序分段写。</w:t>
-      </w:r>
-    </w:p>
-    <w:p>
-      <w:pPr>
-        <w:spacing w:after="80" w:before="220"/>
-      </w:pPr>
-      <w:r>
-        <w:rPr>
-          <w:b/>
-          <w:bCs/>
-          <w:color w:val="1F4E79"/>
-          <w:sz w:val="24"/>
-          <w:szCs w:val="24"/>
-        </w:rPr>
-        <w:t xml:space="preserve">段落顺序</w:t>
-      </w:r>
-    </w:p>
-    <w:p>
-      <w:pPr>
-        <w:pStyle w:val="ListParagraph"/>
-        <w:numPr>
-          <w:ilvl w:val="0"/>
-          <w:numId w:val="3"/>
-        </w:numPr>
-        <w:spacing w:after="60"/>
-      </w:pPr>
-      <w:r>
-        <w:rPr>
-          <w:b/>
-          <w:bCs/>
-        </w:rPr>
-        <w:t xml:space="preserve">研究动机</w:t>
-      </w:r>
-      <w:r>
-        <w:t xml:space="preserve">：应用场景，以及为什么需要 KG Agent。</w:t>
-      </w:r>
-    </w:p>
-    <w:p>
-      <w:pPr>
-        <w:pStyle w:val="ListParagraph"/>
-        <w:numPr>
-          <w:ilvl w:val="0"/>
-          <w:numId w:val="3"/>
-        </w:numPr>
-        <w:spacing w:after="60"/>
-      </w:pPr>
-      <w:r>
-        <w:rPr>
-          <w:b/>
-          <w:bCs/>
-        </w:rPr>
-        <w:t xml:space="preserve">文献综述</w:t>
-      </w:r>
-      <w:r>
-        <w:t xml:space="preserve">：KG 与 KGQA、KG Agent、KG Agent 的评测，各自写出已有研究的不足。</w:t>
-      </w:r>
-    </w:p>
-    <w:p>
-      <w:pPr>
-        <w:pStyle w:val="ListParagraph"/>
-        <w:numPr>
-          <w:ilvl w:val="0"/>
-          <w:numId w:val="3"/>
-        </w:numPr>
-        <w:spacing w:after="60"/>
-      </w:pPr>
-      <w:r>
-        <w:rPr>
-          <w:b/>
-          <w:bCs/>
-        </w:rPr>
-        <w:t xml:space="preserve">研究空白</w:t>
-      </w:r>
-      <w:r>
-        <w:t xml:space="preserve">：汇总上一段的不足。</w:t>
-      </w:r>
-    </w:p>
-    <w:p>
-      <w:pPr>
-        <w:pStyle w:val="ListParagraph"/>
-        <w:numPr>
-          <w:ilvl w:val="0"/>
-          <w:numId w:val="3"/>
-        </w:numPr>
-        <w:spacing w:after="60"/>
-      </w:pPr>
-      <w:r>
-        <w:rPr>
-          <w:b/>
-          <w:bCs/>
-        </w:rPr>
-        <w:t xml:space="preserve">研究目标与研究问题</w:t>
-      </w:r>
-      <w:r>
-        <w:t xml:space="preserve">：总体目标和 RQ1–RQ3。</w:t>
-      </w:r>
-    </w:p>
-    <w:p>
-      <w:pPr>
-        <w:pStyle w:val="ListParagraph"/>
-        <w:numPr>
-          <w:ilvl w:val="0"/>
-          <w:numId w:val="3"/>
-        </w:numPr>
-        <w:spacing w:after="60"/>
-      </w:pPr>
-      <w:r>
-        <w:rPr>
-          <w:b/>
-          <w:bCs/>
-        </w:rPr>
-        <w:t xml:space="preserve">工作流程与论文结构</w:t>
-      </w:r>
-      <w:r>
-        <w:t xml:space="preserve">：按工作阶段讲，每个阶段对应一章。</w:t>
-      </w:r>
-    </w:p>
-    <w:p>
-      <w:pPr>
-        <w:pStyle w:val="ListParagraph"/>
-        <w:numPr>
-          <w:ilvl w:val="0"/>
-          <w:numId w:val="3"/>
-        </w:numPr>
-        <w:spacing w:after="60"/>
-      </w:pPr>
-      <w:r>
-        <w:rPr>
-          <w:b/>
-          <w:bCs/>
-        </w:rPr>
-        <w:t xml:space="preserve">论文工作流程图</w:t>
-      </w:r>
-      <w:r>
-        <w:t xml:space="preserve">。</w:t>
-      </w:r>
-    </w:p>
-    <w:p>
-      <w:pPr>
-        <w:spacing w:after="80" w:before="220"/>
-      </w:pPr>
-      <w:r>
-        <w:rPr>
-          <w:b/>
-          <w:bCs/>
-          <w:color w:val="1F4E79"/>
-          <w:sz w:val="24"/>
-          <w:szCs w:val="24"/>
-        </w:rPr>
-        <w:t xml:space="preserve">各段要写的内容</w:t>
-      </w:r>
-    </w:p>
-    <w:p>
-      <w:pPr>
-        <w:spacing w:after="80" w:before="160"/>
-      </w:pPr>
-      <w:r>
-        <w:rPr>
-          <w:b/>
-          <w:bCs/>
-          <w:color w:val="2E2E2E"/>
-          <w:sz w:val="22"/>
-          <w:szCs w:val="22"/>
-        </w:rPr>
-        <w:t xml:space="preserve">1. 研究动机</w:t>
-      </w:r>
-    </w:p>
-    <w:p>
-      <w:pPr>
-        <w:pStyle w:val="ListParagraph"/>
-        <w:numPr>
-          <w:ilvl w:val="0"/>
-          <w:numId w:val="2"/>
-        </w:numPr>
-        <w:spacing w:after="60"/>
-      </w:pPr>
-      <w:r>
-        <w:t xml:space="preserve">从 Circular Factory 和自组织生产物流两个场景切入。</w:t>
-      </w:r>
-    </w:p>
-    <w:p>
-      <w:pPr>
-        <w:pStyle w:val="ListParagraph"/>
-        <w:numPr>
-          <w:ilvl w:val="0"/>
-          <w:numId w:val="2"/>
-        </w:numPr>
-        <w:spacing w:after="60"/>
-      </w:pPr>
-      <w:r>
-        <w:t xml:space="preserve">KG 能结构化表达这些场景里的实体、能力和关系。</w:t>
-      </w:r>
-    </w:p>
-    <w:p>
-      <w:pPr>
-        <w:pStyle w:val="ListParagraph"/>
-        <w:numPr>
-          <w:ilvl w:val="0"/>
-          <w:numId w:val="2"/>
-        </w:numPr>
-        <w:spacing w:after="60"/>
-      </w:pPr>
-      <w:r>
-        <w:t xml:space="preserve">LLM 不掌握这类专业知识，还可能编造答案，所以需要能在 KG 上做多跳推理的 Agent。</w:t>
+        <w:t xml:space="preserve">按以下顺序排列，具体以 IFL 模板为准：</w:t>
+      </w:r>
+    </w:p>
+    <w:p>
+      <w:pPr>
+        <w:pStyle w:val="ListParagraph"/>
+        <w:numPr>
+          <w:ilvl w:val="0"/>
+          <w:numId w:val="2"/>
+        </w:numPr>
+        <w:spacing w:after="60"/>
+      </w:pPr>
+      <w:r>
+        <w:rPr>
+          <w:b/>
+          <w:bCs/>
+        </w:rPr>
+        <w:t xml:space="preserve">标题页：</w:t>
+      </w:r>
+      <w:r>
+        <w:t xml:space="preserve">用 IFL 的论文模板。</w:t>
+      </w:r>
+    </w:p>
+    <w:p>
+      <w:pPr>
+        <w:pStyle w:val="ListParagraph"/>
+        <w:numPr>
+          <w:ilvl w:val="0"/>
+          <w:numId w:val="2"/>
+        </w:numPr>
+        <w:spacing w:after="60"/>
+      </w:pPr>
+      <w:r>
+        <w:rPr>
+          <w:b/>
+          <w:bCs/>
+        </w:rPr>
+        <w:t xml:space="preserve">Exposé：</w:t>
+      </w:r>
+      <w:r>
+        <w:t xml:space="preserve">签字的原件，放在标题页之后。第 3–5 章的内容要能覆盖其中的每一项任务（「完整性」是排除项）。</w:t>
+      </w:r>
+    </w:p>
+    <w:p>
+      <w:pPr>
+        <w:pStyle w:val="ListParagraph"/>
+        <w:numPr>
+          <w:ilvl w:val="0"/>
+          <w:numId w:val="2"/>
+        </w:numPr>
+        <w:spacing w:after="60"/>
+      </w:pPr>
+      <w:r>
+        <w:rPr>
+          <w:b/>
+          <w:bCs/>
+        </w:rPr>
+        <w:t xml:space="preserve">Declaration of Authorship：</w:t>
+      </w:r>
+      <w:r>
+        <w:t xml:space="preserve">必须签字，没有声明论文不被接收（KIT SPO § 14）。致谢等其他声明按模板放。</w:t>
+      </w:r>
+    </w:p>
+    <w:p>
+      <w:pPr>
+        <w:pStyle w:val="ListParagraph"/>
+        <w:numPr>
+          <w:ilvl w:val="0"/>
+          <w:numId w:val="2"/>
+        </w:numPr>
+        <w:spacing w:after="60"/>
+      </w:pPr>
+      <w:r>
+        <w:rPr>
+          <w:b/>
+          <w:bCs/>
+        </w:rPr>
+        <w:t xml:space="preserve">Abstract（英文）和 Kurzzusammenfassung（德文）：</w:t>
+      </w:r>
+      <w:r>
+        <w:t xml:space="preserve">各不超过一页，写动机、研究问题、方法、结果和结论。</w:t>
+      </w:r>
+    </w:p>
+    <w:p>
+      <w:pPr>
+        <w:pStyle w:val="ListParagraph"/>
+        <w:numPr>
+          <w:ilvl w:val="0"/>
+          <w:numId w:val="2"/>
+        </w:numPr>
+        <w:spacing w:after="60"/>
+      </w:pPr>
+      <w:r>
+        <w:t xml:space="preserve">目录、图目录、表目录；缩写目录看模板是否包含。</w:t>
       </w:r>
     </w:p>
     <w:p>
@@ -399,82 +327,104 @@
         <w:t xml:space="preserve">注意：</w:t>
       </w:r>
       <w:r>
-        <w:t xml:space="preserve">写得简短具体，不讲发展史。</w:t>
-      </w:r>
-    </w:p>
-    <w:p>
-      <w:pPr>
-        <w:spacing w:after="80" w:before="160"/>
-      </w:pPr>
-      <w:r>
-        <w:rPr>
-          <w:b/>
-          <w:bCs/>
-          <w:color w:val="2E2E2E"/>
-          <w:sz w:val="22"/>
-          <w:szCs w:val="22"/>
-        </w:rPr>
-        <w:t xml:space="preserve">2. 文献综述</w:t>
-      </w:r>
-    </w:p>
-    <w:p>
-      <w:pPr>
-        <w:pStyle w:val="ListParagraph"/>
-        <w:numPr>
-          <w:ilvl w:val="0"/>
-          <w:numId w:val="2"/>
-        </w:numPr>
-        <w:spacing w:after="60"/>
-      </w:pPr>
-      <w:r>
-        <w:rPr>
-          <w:b/>
-          <w:bCs/>
-        </w:rPr>
-        <w:t xml:space="preserve">KG 与 KGQA</w:t>
-      </w:r>
-      <w:r>
-        <w:t xml:space="preserve">：交代后文必需的基本概念，包括三元组、SPARQL、RDF 与 property graph 的区别，以及 KGQA 的主流方法。</w:t>
-      </w:r>
-    </w:p>
-    <w:p>
-      <w:pPr>
-        <w:pStyle w:val="ListParagraph"/>
-        <w:numPr>
-          <w:ilvl w:val="0"/>
-          <w:numId w:val="2"/>
-        </w:numPr>
-        <w:spacing w:after="60"/>
-      </w:pPr>
-      <w:r>
-        <w:rPr>
-          <w:b/>
-          <w:bCs/>
-        </w:rPr>
-        <w:t xml:space="preserve">KG Agent</w:t>
-      </w:r>
-      <w:r>
-        <w:t xml:space="preserve">：介绍 Think-on-Graph、Plan-on-Graph、Chain-of-Relations、ARK-V1 的核心思路，指出它们容易漏掉约束、用参数知识补全缺失信息、缺少拒答机制。</w:t>
-      </w:r>
-    </w:p>
-    <w:p>
-      <w:pPr>
-        <w:pStyle w:val="ListParagraph"/>
-        <w:numPr>
-          <w:ilvl w:val="0"/>
-          <w:numId w:val="2"/>
-        </w:numPr>
-        <w:spacing w:after="60"/>
-      </w:pPr>
-      <w:r>
-        <w:rPr>
-          <w:b/>
-          <w:bCs/>
-        </w:rPr>
-        <w:t xml:space="preserve">KG Agent 的评测</w:t>
-      </w:r>
-      <w:r>
-        <w:t xml:space="preserve">：介绍常见数据集和指标，说明 LLM 可能凭记忆答题；再讲 grounding 的评价、不可回答问题（GrailQAbility）和拒答研究，并引出本文使用的 GTSQA 和 CR-LT-KGQA。</w:t>
+        <w:t xml:space="preserve">确认用英文写论文已获审阅人同意（KIT SPO § 14）。如果写作或编程中用了 AI 工具，事先和导师商定怎么披露。</w:t>
+      </w:r>
+    </w:p>
+    <w:p>
+      <w:pPr>
+        <w:pStyle w:val="Heading1"/>
+      </w:pPr>
+      <w:r>
+        <w:t xml:space="preserve">1 Introduction</w:t>
+      </w:r>
+    </w:p>
+    <w:p>
+      <w:pPr>
+        <w:spacing w:after="100"/>
+      </w:pPr>
+      <w:r>
+        <w:t xml:space="preserve">本章按导师给出的三节写，只讲清问题、目标和做法；概念和文献评述放到第 2 章。</w:t>
+      </w:r>
+    </w:p>
+    <w:p>
+      <w:pPr>
+        <w:pBdr>
+          <w:left w:val="single" w:color="2E74B5" w:sz="18" w:space="8"/>
+        </w:pBdr>
+        <w:shd w:fill="EAF2FB" w:color="auto" w:val="clear"/>
+        <w:spacing w:after="120" w:before="60"/>
+        <w:ind w:left="160" w:right="160"/>
+      </w:pPr>
+      <w:r>
+        <w:rPr>
+          <w:b/>
+          <w:bCs/>
+          <w:color w:val="2E74B5"/>
+        </w:rPr>
+        <w:t xml:space="preserve">对应 IFL 评分项：</w:t>
+      </w:r>
+      <w:r>
+        <w:t xml:space="preserve">Einleitung 的四项——工作的意义、问题描述、研究目标、方法与结构——分别落在 1.1、1.1、1.2、1.3。</w:t>
+      </w:r>
+    </w:p>
+    <w:p>
+      <w:pPr>
+        <w:pStyle w:val="Heading2"/>
+      </w:pPr>
+      <w:r>
+        <w:t xml:space="preserve">1.1 Problem Statement</w:t>
+      </w:r>
+    </w:p>
+    <w:p>
+      <w:pPr>
+        <w:pStyle w:val="ListParagraph"/>
+        <w:numPr>
+          <w:ilvl w:val="0"/>
+          <w:numId w:val="2"/>
+        </w:numPr>
+        <w:spacing w:after="60"/>
+      </w:pPr>
+      <w:r>
+        <w:t xml:space="preserve">从 Circular Factory 和自组织生产物流两个场景切入。</w:t>
+      </w:r>
+    </w:p>
+    <w:p>
+      <w:pPr>
+        <w:pStyle w:val="ListParagraph"/>
+        <w:numPr>
+          <w:ilvl w:val="0"/>
+          <w:numId w:val="2"/>
+        </w:numPr>
+        <w:spacing w:after="60"/>
+      </w:pPr>
+      <w:r>
+        <w:t xml:space="preserve">KG 能结构化表达这些场景里的实体、能力和关系。</w:t>
+      </w:r>
+    </w:p>
+    <w:p>
+      <w:pPr>
+        <w:pStyle w:val="ListParagraph"/>
+        <w:numPr>
+          <w:ilvl w:val="0"/>
+          <w:numId w:val="2"/>
+        </w:numPr>
+        <w:spacing w:after="60"/>
+      </w:pPr>
+      <w:r>
+        <w:t xml:space="preserve">LLM 不掌握这类专业知识，还可能编造答案，所以需要能在 KG 上做多跳推理的 Agent。</w:t>
+      </w:r>
+    </w:p>
+    <w:p>
+      <w:pPr>
+        <w:pStyle w:val="ListParagraph"/>
+        <w:numPr>
+          <w:ilvl w:val="0"/>
+          <w:numId w:val="2"/>
+        </w:numPr>
+        <w:spacing w:after="60"/>
+      </w:pPr>
+      <w:r>
+        <w:t xml:space="preserve">用一两句话点出问题：现有 KG Agent 缺少约束验证和拒答能力；现有评测只看最终答案，无法判断答案是否来自 KG。详细论证放在 2.4。</w:t>
       </w:r>
     </w:p>
     <w:p>
@@ -495,102 +445,109 @@
         <w:t xml:space="preserve">注意：</w:t>
       </w:r>
       <w:r>
-        <w:t xml:space="preserve">按主题写，每个方法两三句讲核心思想，具体借鉴的机制等到用到时再展开。</w:t>
-      </w:r>
-    </w:p>
-    <w:p>
-      <w:pPr>
-        <w:spacing w:after="80" w:before="160"/>
-      </w:pPr>
-      <w:r>
-        <w:rPr>
-          <w:b/>
-          <w:bCs/>
-          <w:color w:val="2E2E2E"/>
-          <w:sz w:val="22"/>
-          <w:szCs w:val="22"/>
-        </w:rPr>
-        <w:t xml:space="preserve">3. 研究空白</w:t>
-      </w:r>
-    </w:p>
-    <w:p>
-      <w:pPr>
-        <w:pStyle w:val="ListParagraph"/>
-        <w:numPr>
-          <w:ilvl w:val="0"/>
-          <w:numId w:val="2"/>
-        </w:numPr>
-        <w:spacing w:after="60"/>
-      </w:pPr>
-      <w:r>
-        <w:t xml:space="preserve">用一两句话汇总：现有 KG Agent 缺乏约束验证和拒答能力；现有评测只看最终答案，无法判断答案是否来自 KG。</w:t>
-      </w:r>
-    </w:p>
-    <w:p>
-      <w:pPr>
-        <w:spacing w:after="80" w:before="160"/>
-      </w:pPr>
-      <w:r>
-        <w:rPr>
-          <w:b/>
-          <w:bCs/>
-          <w:color w:val="2E2E2E"/>
-          <w:sz w:val="22"/>
-          <w:szCs w:val="22"/>
-        </w:rPr>
-        <w:t xml:space="preserve">4. 研究目标与研究问题</w:t>
-      </w:r>
-    </w:p>
-    <w:p>
-      <w:pPr>
-        <w:pStyle w:val="ListParagraph"/>
-        <w:numPr>
-          <w:ilvl w:val="0"/>
-          <w:numId w:val="2"/>
-        </w:numPr>
-        <w:spacing w:after="60"/>
-      </w:pPr>
-      <w:r>
-        <w:t xml:space="preserve">由研究空白引出总体目标，再提出 RQ1–RQ3：</w:t>
-      </w:r>
-    </w:p>
-    <w:p>
-      <w:pPr>
-        <w:pStyle w:val="ListParagraph"/>
-        <w:numPr>
-          <w:ilvl w:val="1"/>
-          <w:numId w:val="2"/>
-        </w:numPr>
-        <w:spacing w:after="60"/>
-      </w:pPr>
-      <w:r>
-        <w:t xml:space="preserve">RQ1：如何评价答案正确率以外的能力，即证据覆盖和拒答？</w:t>
-      </w:r>
-    </w:p>
-    <w:p>
-      <w:pPr>
-        <w:pStyle w:val="ListParagraph"/>
-        <w:numPr>
-          <w:ilvl w:val="1"/>
-          <w:numId w:val="2"/>
-        </w:numPr>
-        <w:spacing w:after="60"/>
-      </w:pPr>
-      <w:r>
-        <w:t xml:space="preserve">RQ2：基线 Agent 在多跳 KGQA 上有哪些失败模式？</w:t>
-      </w:r>
-    </w:p>
-    <w:p>
-      <w:pPr>
-        <w:pStyle w:val="ListParagraph"/>
-        <w:numPr>
-          <w:ilvl w:val="1"/>
-          <w:numId w:val="2"/>
-        </w:numPr>
-        <w:spacing w:after="60"/>
-      </w:pPr>
-      <w:r>
-        <w:t xml:space="preserve">RQ3：针对这些失败模式的架构改进，效果如何？</w:t>
+        <w:t xml:space="preserve">写得简短具体，不讲发展史，也不在这里展开文献。</w:t>
+      </w:r>
+    </w:p>
+    <w:p>
+      <w:pPr>
+        <w:pBdr>
+          <w:left w:val="single" w:color="2E74B5" w:sz="18" w:space="8"/>
+        </w:pBdr>
+        <w:shd w:fill="EAF2FB" w:color="auto" w:val="clear"/>
+        <w:spacing w:after="120" w:before="60"/>
+        <w:ind w:left="160" w:right="160"/>
+      </w:pPr>
+      <w:r>
+        <w:rPr>
+          <w:b/>
+          <w:bCs/>
+          <w:color w:val="2E74B5"/>
+        </w:rPr>
+        <w:t xml:space="preserve">对应 IFL 评分项：</w:t>
+      </w:r>
+      <w:r>
+        <w:t xml:space="preserve">工作的意义（Bedeutung der eigenen Arbeit）、问题描述（Problembeschreibung）。</w:t>
+      </w:r>
+    </w:p>
+    <w:p>
+      <w:pPr>
+        <w:pStyle w:val="Heading2"/>
+      </w:pPr>
+      <w:r>
+        <w:t xml:space="preserve">1.2 Objectives</w:t>
+      </w:r>
+    </w:p>
+    <w:p>
+      <w:pPr>
+        <w:pStyle w:val="ListParagraph"/>
+        <w:numPr>
+          <w:ilvl w:val="0"/>
+          <w:numId w:val="2"/>
+        </w:numPr>
+        <w:spacing w:after="60"/>
+      </w:pPr>
+      <w:r>
+        <w:t xml:space="preserve">由 1.1 的问题引出总体目标，再提出 RQ1–RQ3：</w:t>
+      </w:r>
+    </w:p>
+    <w:p>
+      <w:pPr>
+        <w:pStyle w:val="ListParagraph"/>
+        <w:numPr>
+          <w:ilvl w:val="0"/>
+          <w:numId w:val="2"/>
+        </w:numPr>
+        <w:spacing w:after="60"/>
+      </w:pPr>
+      <w:r>
+        <w:rPr>
+          <w:b/>
+          <w:bCs/>
+        </w:rPr>
+        <w:t xml:space="preserve">RQ1：</w:t>
+      </w:r>
+      <w:r>
+        <w:t xml:space="preserve">如何评价答案正确率以外的能力，即证据覆盖和拒答？</w:t>
+      </w:r>
+    </w:p>
+    <w:p>
+      <w:pPr>
+        <w:pStyle w:val="ListParagraph"/>
+        <w:numPr>
+          <w:ilvl w:val="0"/>
+          <w:numId w:val="2"/>
+        </w:numPr>
+        <w:spacing w:after="60"/>
+      </w:pPr>
+      <w:r>
+        <w:rPr>
+          <w:b/>
+          <w:bCs/>
+        </w:rPr>
+        <w:t xml:space="preserve">RQ2：</w:t>
+      </w:r>
+      <w:r>
+        <w:t xml:space="preserve">基线 Agent 在多跳 KGQA 上有哪些失败模式？</w:t>
+      </w:r>
+    </w:p>
+    <w:p>
+      <w:pPr>
+        <w:pStyle w:val="ListParagraph"/>
+        <w:numPr>
+          <w:ilvl w:val="0"/>
+          <w:numId w:val="2"/>
+        </w:numPr>
+        <w:spacing w:after="60"/>
+      </w:pPr>
+      <w:r>
+        <w:rPr>
+          <w:b/>
+          <w:bCs/>
+        </w:rPr>
+        <w:t xml:space="preserve">RQ3：</w:t>
+      </w:r>
+      <w:r>
+        <w:t xml:space="preserve">针对这些失败模式的架构改进，效果如何？</w:t>
       </w:r>
     </w:p>
     <w:p>
@@ -611,7 +568,36 @@
         <w:t xml:space="preserve">注意：</w:t>
       </w:r>
       <w:r>
-        <w:t xml:space="preserve">每个 RQ 都要能对应到前面写出的某个不足。贡献不写在这里，放到第 7 章。</w:t>
+        <w:t xml:space="preserve">每个 RQ 都要能对应到 2.4 中的某条研究空白。贡献不写在这里，放到 6.2。</w:t>
+      </w:r>
+    </w:p>
+    <w:p>
+      <w:pPr>
+        <w:pBdr>
+          <w:left w:val="single" w:color="2E74B5" w:sz="18" w:space="8"/>
+        </w:pBdr>
+        <w:shd w:fill="EAF2FB" w:color="auto" w:val="clear"/>
+        <w:spacing w:after="120" w:before="60"/>
+        <w:ind w:left="160" w:right="160"/>
+      </w:pPr>
+      <w:r>
+        <w:rPr>
+          <w:b/>
+          <w:bCs/>
+          <w:color w:val="2E74B5"/>
+        </w:rPr>
+        <w:t xml:space="preserve">对应 IFL 评分项：</w:t>
+      </w:r>
+      <w:r>
+        <w:t xml:space="preserve">研究目标（Zielstellung）。</w:t>
+      </w:r>
+    </w:p>
+    <w:p>
+      <w:pPr>
+        <w:pStyle w:val="Heading2"/>
+      </w:pPr>
+      <w:r>
+        <w:t xml:space="preserve">1.3 Approach and Thesis Structure</w:t>
       </w:r>
     </w:p>
     <w:p>
@@ -626,33 +612,33 @@
           <w:sz w:val="22"/>
           <w:szCs w:val="22"/>
         </w:rPr>
-        <w:t xml:space="preserve">5. 工作流程与论文结构</w:t>
-      </w:r>
-    </w:p>
-    <w:p>
-      <w:pPr>
-        <w:pStyle w:val="ListParagraph"/>
-        <w:numPr>
-          <w:ilvl w:val="0"/>
-          <w:numId w:val="2"/>
-        </w:numPr>
-        <w:spacing w:after="60"/>
-      </w:pPr>
-      <w:r>
-        <w:t xml:space="preserve">按工作阶段讲：基线分析与适配 → 评测框架与数据准备 → 基线诊断 → ARK-V2 设计 → 对比评测。</w:t>
-      </w:r>
-    </w:p>
-    <w:p>
-      <w:pPr>
-        <w:pStyle w:val="ListParagraph"/>
-        <w:numPr>
-          <w:ilvl w:val="0"/>
-          <w:numId w:val="2"/>
-        </w:numPr>
-        <w:spacing w:after="60"/>
-      </w:pPr>
-      <w:r>
-        <w:t xml:space="preserve">每个阶段说明对应哪一章、回答哪个 RQ。</w:t>
+        <w:t xml:space="preserve">工作流程与论文结构</w:t>
+      </w:r>
+    </w:p>
+    <w:p>
+      <w:pPr>
+        <w:pStyle w:val="ListParagraph"/>
+        <w:numPr>
+          <w:ilvl w:val="0"/>
+          <w:numId w:val="2"/>
+        </w:numPr>
+        <w:spacing w:after="60"/>
+      </w:pPr>
+      <w:r>
+        <w:t xml:space="preserve">按工作阶段讲：评测框架与数据准备 → 基线诊断 → ARK-V2 设计 → 对比评测。</w:t>
+      </w:r>
+    </w:p>
+    <w:p>
+      <w:pPr>
+        <w:pStyle w:val="ListParagraph"/>
+        <w:numPr>
+          <w:ilvl w:val="0"/>
+          <w:numId w:val="2"/>
+        </w:numPr>
+        <w:spacing w:after="60"/>
+      </w:pPr>
+      <w:r>
+        <w:t xml:space="preserve">每个阶段说明对应哪一章、回答哪个 RQ：第 3 章对应 RQ1，4.1–4.2 对应 RQ2，4.3 和第 5 章对应 RQ3。</w:t>
       </w:r>
     </w:p>
     <w:p>
@@ -673,7 +659,7 @@
         <w:t xml:space="preserve">注意：</w:t>
       </w:r>
       <w:r>
-        <w:t xml:space="preserve">不用再逐章罗列。</w:t>
+        <w:t xml:space="preserve">按阶段讲，不用逐章罗列，但第 2–7 章都要被提到。</w:t>
       </w:r>
     </w:p>
     <w:p>
@@ -688,20 +674,20 @@
           <w:sz w:val="22"/>
           <w:szCs w:val="22"/>
         </w:rPr>
-        <w:t xml:space="preserve">6. 论文工作流程图</w:t>
-      </w:r>
-    </w:p>
-    <w:p>
-      <w:pPr>
-        <w:pStyle w:val="ListParagraph"/>
-        <w:numPr>
-          <w:ilvl w:val="0"/>
-          <w:numId w:val="2"/>
-        </w:numPr>
-        <w:spacing w:after="60"/>
-      </w:pPr>
-      <w:r>
-        <w:t xml:space="preserve">横向画 5 个阶段，每个阶段下面标注章节号和主要产出。</w:t>
+        <w:t xml:space="preserve">论文工作流程图</w:t>
+      </w:r>
+    </w:p>
+    <w:p>
+      <w:pPr>
+        <w:pStyle w:val="ListParagraph"/>
+        <w:numPr>
+          <w:ilvl w:val="0"/>
+          <w:numId w:val="2"/>
+        </w:numPr>
+        <w:spacing w:after="60"/>
+      </w:pPr>
+      <w:r>
+        <w:t xml:space="preserve">横向画 4 个阶段，每个阶段下面标注章节号和主要产出。</w:t>
       </w:r>
     </w:p>
     <w:p>
@@ -732,10 +718,60 @@
     </w:p>
     <w:p>
       <w:pPr>
+        <w:pBdr>
+          <w:left w:val="single" w:color="2E74B5" w:sz="18" w:space="8"/>
+        </w:pBdr>
+        <w:shd w:fill="EAF2FB" w:color="auto" w:val="clear"/>
+        <w:spacing w:after="120" w:before="60"/>
+        <w:ind w:left="160" w:right="160"/>
+      </w:pPr>
+      <w:r>
+        <w:rPr>
+          <w:b/>
+          <w:bCs/>
+          <w:color w:val="2E74B5"/>
+        </w:rPr>
+        <w:t xml:space="preserve">对应 IFL 评分项：</w:t>
+      </w:r>
+      <w:r>
+        <w:t xml:space="preserve">方法与论文结构的说明（Vorgehensweise und Darstellung der Gliederung）。</w:t>
+      </w:r>
+    </w:p>
+    <w:p>
+      <w:pPr>
         <w:pStyle w:val="Heading1"/>
       </w:pPr>
       <w:r>
-        <w:t xml:space="preserve">2 Baseline Agent: ARK-V1 and ARK-V1.1</w:t>
+        <w:t xml:space="preserve">2 Background and Current State of Research</w:t>
+      </w:r>
+    </w:p>
+    <w:p>
+      <w:pPr>
+        <w:spacing w:after="100"/>
+      </w:pPr>
+      <w:r>
+        <w:t xml:space="preserve">开头用一两句话说明本章结构：2.1 交代概念，2.2 和 2.3 评述两个主题的已有研究，2.4 汇总研究空白。</w:t>
+      </w:r>
+    </w:p>
+    <w:p>
+      <w:pPr>
+        <w:pBdr>
+          <w:left w:val="single" w:color="2E74B5" w:sz="18" w:space="8"/>
+        </w:pBdr>
+        <w:shd w:fill="EAF2FB" w:color="auto" w:val="clear"/>
+        <w:spacing w:after="120" w:before="60"/>
+        <w:ind w:left="160" w:right="160"/>
+      </w:pPr>
+      <w:r>
+        <w:rPr>
+          <w:b/>
+          <w:bCs/>
+          <w:color w:val="2E74B5"/>
+        </w:rPr>
+        <w:t xml:space="preserve">对应 IFL 评分项：</w:t>
+      </w:r>
+      <w:r>
+        <w:t xml:space="preserve">已有科学研究（×2）、文献选择（×3）。</w:t>
       </w:r>
     </w:p>
     <w:p>
@@ -743,7 +779,7 @@
         <w:pStyle w:val="Heading2"/>
       </w:pPr>
       <w:r>
-        <w:t xml:space="preserve">2.1 Architecture and Workflow of ARK-V1</w:t>
+        <w:t xml:space="preserve">2.1 Knowledge Graphs and KGQA</w:t>
       </w:r>
     </w:p>
     <w:p>
@@ -751,7 +787,383 @@
         <w:spacing w:after="100"/>
       </w:pPr>
       <w:r>
-        <w:t xml:space="preserve">介绍 ARK-V1 的 LangGraph 节点流程（select_anchor → select_relation → reasoning → cleanup → generate_answer）、状态结构、图访问接口、终止条件。</w:t>
+        <w:t xml:space="preserve">只交代后文必需的基本概念：</w:t>
+      </w:r>
+    </w:p>
+    <w:p>
+      <w:pPr>
+        <w:pStyle w:val="ListParagraph"/>
+        <w:numPr>
+          <w:ilvl w:val="0"/>
+          <w:numId w:val="2"/>
+        </w:numPr>
+        <w:spacing w:after="60"/>
+      </w:pPr>
+      <w:r>
+        <w:t xml:space="preserve">KG：实体、关系、三元组；RDF 与 property graph 的区别；SPARQL 查询。</w:t>
+      </w:r>
+    </w:p>
+    <w:p>
+      <w:pPr>
+        <w:pStyle w:val="ListParagraph"/>
+        <w:numPr>
+          <w:ilvl w:val="0"/>
+          <w:numId w:val="2"/>
+        </w:numPr>
+        <w:spacing w:after="60"/>
+      </w:pPr>
+      <w:r>
+        <w:t xml:space="preserve">KGQA 任务：输入和输出是什么、什么叫多跳问题，以及答案在图上怎么表示（答案实体、gold answer subgraph）。</w:t>
+      </w:r>
+    </w:p>
+    <w:p>
+      <w:pPr>
+        <w:pBdr>
+          <w:left w:val="single" w:color="E8A33D" w:sz="18" w:space="8"/>
+        </w:pBdr>
+        <w:shd w:fill="FFF4E5" w:color="auto" w:val="clear"/>
+        <w:spacing w:after="120" w:before="60"/>
+        <w:ind w:left="160" w:right="160"/>
+      </w:pPr>
+      <w:r>
+        <w:rPr>
+          <w:b/>
+          <w:bCs/>
+          <w:color w:val="E8A33D"/>
+        </w:rPr>
+        <w:t xml:space="preserve">注意：</w:t>
+      </w:r>
+      <w:r>
+        <w:t xml:space="preserve">这一节只解释概念，不写不足，也不展开发展史。只写后文用得到的概念，每个概念配标准引用。</w:t>
+      </w:r>
+    </w:p>
+    <w:p>
+      <w:pPr>
+        <w:pStyle w:val="Heading2"/>
+      </w:pPr>
+      <w:r>
+        <w:t xml:space="preserve">2.2 LLM-based KG Agents</w:t>
+      </w:r>
+    </w:p>
+    <w:p>
+      <w:pPr>
+        <w:pStyle w:val="ListParagraph"/>
+        <w:numPr>
+          <w:ilvl w:val="0"/>
+          <w:numId w:val="2"/>
+        </w:numPr>
+        <w:spacing w:after="60"/>
+      </w:pPr>
+      <w:r>
+        <w:t xml:space="preserve">KGQA 的主流方法路线：语义解析、检索式、Agent 式。用一段话带过，最后用一句话说明本文为什么走 Agent 路线。</w:t>
+      </w:r>
+    </w:p>
+    <w:p>
+      <w:pPr>
+        <w:pStyle w:val="ListParagraph"/>
+        <w:numPr>
+          <w:ilvl w:val="0"/>
+          <w:numId w:val="2"/>
+        </w:numPr>
+        <w:spacing w:after="60"/>
+      </w:pPr>
+      <w:r>
+        <w:t xml:space="preserve">KG Agent：介绍 Think-on-Graph、Plan-on-Graph、Chain-of-Relations、ARK-V1 的核心思路。ARK-V1 在这里只讲核心思想，具体流程放到 4.1。</w:t>
+      </w:r>
+    </w:p>
+    <w:p>
+      <w:pPr>
+        <w:pStyle w:val="ListParagraph"/>
+        <w:numPr>
+          <w:ilvl w:val="0"/>
+          <w:numId w:val="2"/>
+        </w:numPr>
+        <w:spacing w:after="60"/>
+      </w:pPr>
+      <w:r>
+        <w:rPr>
+          <w:b/>
+          <w:bCs/>
+        </w:rPr>
+        <w:t xml:space="preserve">结尾写出不足：</w:t>
+      </w:r>
+      <w:r>
+        <w:t xml:space="preserve">容易漏掉约束、用参数知识补全缺失信息、缺少拒答机制。这些不足引出 RQ2 和 RQ3。</w:t>
+      </w:r>
+    </w:p>
+    <w:p>
+      <w:pPr>
+        <w:pStyle w:val="Heading2"/>
+      </w:pPr>
+      <w:r>
+        <w:t xml:space="preserve">2.3 Evaluation of KG Agents</w:t>
+      </w:r>
+    </w:p>
+    <w:p>
+      <w:pPr>
+        <w:pStyle w:val="ListParagraph"/>
+        <w:numPr>
+          <w:ilvl w:val="0"/>
+          <w:numId w:val="2"/>
+        </w:numPr>
+        <w:spacing w:after="60"/>
+      </w:pPr>
+      <w:r>
+        <w:t xml:space="preserve">介绍常见数据集和指标，说明 LLM 可能凭记忆答题。</w:t>
+      </w:r>
+    </w:p>
+    <w:p>
+      <w:pPr>
+        <w:pStyle w:val="ListParagraph"/>
+        <w:numPr>
+          <w:ilvl w:val="0"/>
+          <w:numId w:val="2"/>
+        </w:numPr>
+        <w:spacing w:after="60"/>
+      </w:pPr>
+      <w:r>
+        <w:t xml:space="preserve">再讲 grounding 的评价、不可回答问题（GrailQAbility）和拒答研究，并引出本文使用的 GTSQA 和 CR-LT-KGQA。</w:t>
+      </w:r>
+    </w:p>
+    <w:p>
+      <w:pPr>
+        <w:pStyle w:val="ListParagraph"/>
+        <w:numPr>
+          <w:ilvl w:val="0"/>
+          <w:numId w:val="2"/>
+        </w:numPr>
+        <w:spacing w:after="60"/>
+      </w:pPr>
+      <w:r>
+        <w:rPr>
+          <w:b/>
+          <w:bCs/>
+        </w:rPr>
+        <w:t xml:space="preserve">结尾写出不足：</w:t>
+      </w:r>
+      <w:r>
+        <w:t xml:space="preserve">现有评测只看最终答案，无法判断答案是否来自 KG。这一不足引出 RQ1。</w:t>
+      </w:r>
+    </w:p>
+    <w:p>
+      <w:pPr>
+        <w:pBdr>
+          <w:left w:val="single" w:color="E8A33D" w:sz="18" w:space="8"/>
+        </w:pBdr>
+        <w:shd w:fill="FFF4E5" w:color="auto" w:val="clear"/>
+        <w:spacing w:after="120" w:before="60"/>
+        <w:ind w:left="160" w:right="160"/>
+      </w:pPr>
+      <w:r>
+        <w:rPr>
+          <w:b/>
+          <w:bCs/>
+          <w:color w:val="E8A33D"/>
+        </w:rPr>
+        <w:t xml:space="preserve">注意：</w:t>
+      </w:r>
+      <w:r>
+        <w:t xml:space="preserve">2.2 和 2.3 按主题写，每个方法两三句讲核心思想，具体借鉴的机制等到用到时再展开。覆盖面要完整（「文献选择」权重 ×3），只有实际借鉴的方法才展开细讲。</w:t>
+      </w:r>
+    </w:p>
+    <w:p>
+      <w:pPr>
+        <w:pStyle w:val="Heading2"/>
+      </w:pPr>
+      <w:r>
+        <w:t xml:space="preserve">2.4 Research Gap</w:t>
+      </w:r>
+    </w:p>
+    <w:p>
+      <w:pPr>
+        <w:pStyle w:val="ListParagraph"/>
+        <w:numPr>
+          <w:ilvl w:val="0"/>
+          <w:numId w:val="2"/>
+        </w:numPr>
+        <w:spacing w:after="60"/>
+      </w:pPr>
+      <w:r>
+        <w:t xml:space="preserve">用一两句话汇总 2.2 和 2.3 的不足：现有 KG Agent 缺乏约束验证和拒答能力；现有评测只看最终答案，无法判断答案是否来自 KG。</w:t>
+      </w:r>
+    </w:p>
+    <w:p>
+      <w:pPr>
+        <w:pStyle w:val="ListParagraph"/>
+        <w:numPr>
+          <w:ilvl w:val="0"/>
+          <w:numId w:val="2"/>
+        </w:numPr>
+        <w:spacing w:after="60"/>
+      </w:pPr>
+      <w:r>
+        <w:t xml:space="preserve">每条研究空白对应 1.2 中的一个 RQ。</w:t>
+      </w:r>
+    </w:p>
+    <w:p>
+      <w:pPr>
+        <w:pBdr>
+          <w:left w:val="single" w:color="E8A33D" w:sz="18" w:space="8"/>
+        </w:pBdr>
+        <w:shd w:fill="FFF4E5" w:color="auto" w:val="clear"/>
+        <w:spacing w:after="120" w:before="60"/>
+        <w:ind w:left="160" w:right="160"/>
+      </w:pPr>
+      <w:r>
+        <w:rPr>
+          <w:b/>
+          <w:bCs/>
+          <w:color w:val="E8A33D"/>
+        </w:rPr>
+        <w:t xml:space="preserve">注意：</w:t>
+      </w:r>
+      <w:r>
+        <w:t xml:space="preserve">这一节只汇总，不引入新的文献。</w:t>
+      </w:r>
+    </w:p>
+    <w:p>
+      <w:pPr>
+        <w:pStyle w:val="Heading1"/>
+      </w:pPr>
+      <w:r>
+        <w:t xml:space="preserve">3 Evaluation Framework</w:t>
+      </w:r>
+    </w:p>
+    <w:p>
+      <w:pPr>
+        <w:pStyle w:val="Heading2"/>
+      </w:pPr>
+      <w:r>
+        <w:t xml:space="preserve">3.1 From Agent Capabilities to Metrics</w:t>
+      </w:r>
+    </w:p>
+    <w:p>
+      <w:pPr>
+        <w:spacing w:after="100"/>
+      </w:pPr>
+      <w:r>
+        <w:t xml:space="preserve">用一张表把四个层次对应起来：能力 → 测试任务 → 数据与标注 → 指标。这一节是整个评测设计的总纲。</w:t>
+      </w:r>
+    </w:p>
+    <w:p>
+      <w:pPr>
+        <w:pBdr>
+          <w:left w:val="single" w:color="E8A33D" w:sz="18" w:space="8"/>
+        </w:pBdr>
+        <w:shd w:fill="FFF4E5" w:color="auto" w:val="clear"/>
+        <w:spacing w:after="120" w:before="60"/>
+        <w:ind w:left="160" w:right="160"/>
+      </w:pPr>
+      <w:r>
+        <w:rPr>
+          <w:b/>
+          <w:bCs/>
+          <w:color w:val="E8A33D"/>
+        </w:rPr>
+        <w:t xml:space="preserve">注意：</w:t>
+      </w:r>
+      <w:r>
+        <w:t xml:space="preserve">Problem Understanding 不做定量评价，只通过案例分析，这里要说明理由。</w:t>
+      </w:r>
+    </w:p>
+    <w:p>
+      <w:pPr>
+        <w:pStyle w:val="Heading2"/>
+      </w:pPr>
+      <w:r>
+        <w:t xml:space="preserve">3.2 Datasets</w:t>
+      </w:r>
+    </w:p>
+    <w:p>
+      <w:pPr>
+        <w:spacing w:after="100"/>
+      </w:pPr>
+      <w:r>
+        <w:t xml:space="preserve">分别介绍三个数据集：</w:t>
+      </w:r>
+    </w:p>
+    <w:p>
+      <w:pPr>
+        <w:pStyle w:val="ListParagraph"/>
+        <w:numPr>
+          <w:ilvl w:val="0"/>
+          <w:numId w:val="2"/>
+        </w:numPr>
+        <w:spacing w:after="60"/>
+      </w:pPr>
+      <w:r>
+        <w:t xml:space="preserve">GTSQA：question-specific graph、gold answer subgraph、图结构类型。</w:t>
+      </w:r>
+    </w:p>
+    <w:p>
+      <w:pPr>
+        <w:pStyle w:val="ListParagraph"/>
+        <w:numPr>
+          <w:ilvl w:val="0"/>
+          <w:numId w:val="2"/>
+        </w:numPr>
+        <w:spacing w:after="60"/>
+      </w:pPr>
+      <w:r>
+        <w:t xml:space="preserve">CR-LT-KGQA：Boolean 答案，KG 证据加常识推理，以及它在本文中的角色。</w:t>
+      </w:r>
+    </w:p>
+    <w:p>
+      <w:pPr>
+        <w:pStyle w:val="ListParagraph"/>
+        <w:numPr>
+          <w:ilvl w:val="0"/>
+          <w:numId w:val="2"/>
+        </w:numPr>
+        <w:spacing w:after="60"/>
+      </w:pPr>
+      <w:r>
+        <w:t xml:space="preserve">GTSQA-UA：在 3.3 详述。</w:t>
+      </w:r>
+    </w:p>
+    <w:p>
+      <w:pPr>
+        <w:spacing w:after="100"/>
+      </w:pPr>
+      <w:r>
+        <w:t xml:space="preserve">然后写开发集和正式测试集怎么划分：正式测试集按图结构类型分层抽样，UA 变体跟着原题放在同一侧。</w:t>
+      </w:r>
+    </w:p>
+    <w:p>
+      <w:pPr>
+        <w:pBdr>
+          <w:left w:val="single" w:color="E8A33D" w:sz="18" w:space="8"/>
+        </w:pBdr>
+        <w:shd w:fill="FFF4E5" w:color="auto" w:val="clear"/>
+        <w:spacing w:after="120" w:before="60"/>
+        <w:ind w:left="160" w:right="160"/>
+      </w:pPr>
+      <w:r>
+        <w:rPr>
+          <w:b/>
+          <w:bCs/>
+          <w:color w:val="E8A33D"/>
+        </w:rPr>
+        <w:t xml:space="preserve">注意：</w:t>
+      </w:r>
+      <w:r>
+        <w:t xml:space="preserve">开发题来自 GTSQA test split，要主动说明这一点以及隔离措施。</w:t>
+      </w:r>
+    </w:p>
+    <w:p>
+      <w:pPr>
+        <w:pStyle w:val="Heading2"/>
+      </w:pPr>
+      <w:r>
+        <w:t xml:space="preserve">3.3 Construction of GTSQA-UA</w:t>
+      </w:r>
+    </w:p>
+    <w:p>
+      <w:pPr>
+        <w:spacing w:after="100"/>
+      </w:pPr>
+      <w:r>
+        <w:t xml:space="preserve">写受控事实删除的方法和“不可回答”的操作性定义：原图查询返回 gold 答案，删除事实后同一查询返回空结果。再写验证流程、原题与变体的配对设计，以及局限（依赖 gold SPARQL 的语义正确性）。方法来源 GrailQAbility 的受控删除在这里具体交代。</w:t>
       </w:r>
     </w:p>
     <w:p>
@@ -772,7 +1184,7 @@
         <w:t xml:space="preserve">建议：</w:t>
       </w:r>
       <w:r>
-        <w:t xml:space="preserve">配一张流程图，再用一道题演示完整执行过程，最好就用第 4 章会分析的题，后面可以复用。</w:t>
+        <w:t xml:space="preserve">配一个具体例子，展示删除前后的图片段。</w:t>
       </w:r>
     </w:p>
     <w:p>
@@ -780,7 +1192,7 @@
         <w:pStyle w:val="Heading2"/>
       </w:pPr>
       <w:r>
-        <w:t xml:space="preserve">2.2 Adaptation to GTSQA: ARK-V1.1</w:t>
+        <w:t xml:space="preserve">3.4 Metrics</w:t>
       </w:r>
     </w:p>
     <w:p>
@@ -788,59 +1200,80 @@
         <w:spacing w:after="100"/>
       </w:pPr>
       <w:r>
-        <w:t xml:space="preserve">把 V1.1 的改动按四类写，每类说明改了什么、为什么必须改：</w:t>
-      </w:r>
-    </w:p>
-    <w:p>
-      <w:pPr>
-        <w:pStyle w:val="ListParagraph"/>
-        <w:numPr>
-          <w:ilvl w:val="0"/>
-          <w:numId w:val="2"/>
-        </w:numPr>
-        <w:spacing w:after="60"/>
-      </w:pPr>
-      <w:r>
-        <w:t xml:space="preserve">数据/图接口适配：triple adapter、MultiDiGraph、incoming/outgoing 双向查询。</w:t>
-      </w:r>
-    </w:p>
-    <w:p>
-      <w:pPr>
-        <w:pStyle w:val="ListParagraph"/>
-        <w:numPr>
-          <w:ilvl w:val="0"/>
-          <w:numId w:val="2"/>
-        </w:numPr>
-        <w:spacing w:after="60"/>
-      </w:pPr>
-      <w:r>
-        <w:t xml:space="preserve">实现正确性修复：重试路由、状态重置。</w:t>
-      </w:r>
-    </w:p>
-    <w:p>
-      <w:pPr>
-        <w:pStyle w:val="ListParagraph"/>
-        <w:numPr>
-          <w:ilvl w:val="0"/>
-          <w:numId w:val="2"/>
-        </w:numPr>
-        <w:spacing w:after="60"/>
-      </w:pPr>
-      <w:r>
-        <w:t xml:space="preserve">输出处理增强：结构化答案、None 与 [] 的区分、QID 补全。</w:t>
-      </w:r>
-    </w:p>
-    <w:p>
-      <w:pPr>
-        <w:pStyle w:val="ListParagraph"/>
-        <w:numPr>
-          <w:ilvl w:val="0"/>
-          <w:numId w:val="2"/>
-        </w:numPr>
-        <w:spacing w:after="60"/>
-      </w:pPr>
-      <w:r>
-        <w:t xml:space="preserve">Prompt/行为调整。</w:t>
+        <w:t xml:space="preserve">逐个给出指标的定义、公式、适用的数据集和解释边界：</w:t>
+      </w:r>
+    </w:p>
+    <w:p>
+      <w:pPr>
+        <w:pStyle w:val="ListParagraph"/>
+        <w:numPr>
+          <w:ilvl w:val="0"/>
+          <w:numId w:val="2"/>
+        </w:numPr>
+        <w:spacing w:after="60"/>
+      </w:pPr>
+      <w:r>
+        <w:t xml:space="preserve">Entity EM、Boolean EM</w:t>
+      </w:r>
+    </w:p>
+    <w:p>
+      <w:pPr>
+        <w:pStyle w:val="ListParagraph"/>
+        <w:numPr>
+          <w:ilvl w:val="0"/>
+          <w:numId w:val="2"/>
+        </w:numPr>
+        <w:spacing w:after="60"/>
+      </w:pPr>
+      <w:r>
+        <w:t xml:space="preserve">Graph Evidence Coverage</w:t>
+      </w:r>
+    </w:p>
+    <w:p>
+      <w:pPr>
+        <w:pStyle w:val="ListParagraph"/>
+        <w:numPr>
+          <w:ilvl w:val="0"/>
+          <w:numId w:val="2"/>
+        </w:numPr>
+        <w:spacing w:after="60"/>
+      </w:pPr>
+      <w:r>
+        <w:t xml:space="preserve">回答/拒答决策准确率、UA 上的幻觉率、原题上的误拒率</w:t>
+      </w:r>
+    </w:p>
+    <w:p>
+      <w:pPr>
+        <w:pStyle w:val="ListParagraph"/>
+        <w:numPr>
+          <w:ilvl w:val="0"/>
+          <w:numId w:val="2"/>
+        </w:numPr>
+        <w:spacing w:after="60"/>
+      </w:pPr>
+      <w:r>
+        <w:t xml:space="preserve">执行失败率</w:t>
+      </w:r>
+    </w:p>
+    <w:p>
+      <w:pPr>
+        <w:pStyle w:val="ListParagraph"/>
+        <w:numPr>
+          <w:ilvl w:val="0"/>
+          <w:numId w:val="2"/>
+        </w:numPr>
+        <w:spacing w:after="60"/>
+      </w:pPr>
+      <w:r>
+        <w:t xml:space="preserve">成本：token、LLM 调用次数、耗时</w:t>
+      </w:r>
+    </w:p>
+    <w:p>
+      <w:pPr>
+        <w:spacing w:after="100"/>
+      </w:pPr>
+      <w:r>
+        <w:t xml:space="preserve">最后用一段话说明分析维度用图结构类型，而不是跳数：跳数不等于难度，比如 5 条边的单路径题可能比 2–3 条边的多分支题更简单；而且结构类型是 GTSQA 自带的标注，方便分层抽样。</w:t>
       </w:r>
     </w:p>
     <w:p>
@@ -861,7 +1294,7 @@
         <w:t xml:space="preserve">注意：</w:t>
       </w:r>
       <w:r>
-        <w:t xml:space="preserve">最后一类必须如实写出来。它改变了 Agent 的行为，所以 V1.1 不能被称为“原版”。</w:t>
+        <w:t xml:space="preserve">每个指标都要写“它不能证明什么”，见写作注意事项第 3 条。</w:t>
       </w:r>
     </w:p>
     <w:p>
@@ -869,7 +1302,7 @@
         <w:pStyle w:val="Heading2"/>
       </w:pPr>
       <w:r>
-        <w:t xml:space="preserve">2.3 Baseline Definition</w:t>
+        <w:t xml:space="preserve">3.5 Evaluation Pipeline</w:t>
       </w:r>
     </w:p>
     <w:p>
@@ -877,7 +1310,135 @@
         <w:spacing w:after="100"/>
       </w:pPr>
       <w:r>
-        <w:t xml:space="preserve">写清冻结基线的具体内容：代码提交、Prompt 版本、模型、探索与重试预算、答案规范化规则。还要说明为什么冻结后不再修改 V1.1，因为要保证和 V2 比较时公平。</w:t>
+        <w:t xml:space="preserve">讲清两点：一是和具体 Agent 架构无关的统一输出接口（答案、回答状态、执行状态、终止原因），让 V1.1 和 V2 能在同一条流程里公平比较；二是计划运行的样本先登记，失败的样本不会从统计里消失。</w:t>
+      </w:r>
+    </w:p>
+    <w:p>
+      <w:pPr>
+        <w:spacing w:after="100"/>
+      </w:pPr>
+      <w:r>
+        <w:t xml:space="preserve">再写日志需求：为了计算 3.4 的指标，Agent 运行时需要记录哪些信息。</w:t>
+      </w:r>
+    </w:p>
+    <w:p>
+      <w:pPr>
+        <w:spacing w:after="100"/>
+      </w:pPr>
+      <w:r>
+        <w:t xml:space="preserve">端到端数据流：Dataset → Adapter → Agent → trace → evaluator → 结果导出。Langfuse 用一句话交代即可。</w:t>
+      </w:r>
+    </w:p>
+    <w:p>
+      <w:pPr>
+        <w:pBdr>
+          <w:left w:val="single" w:color="5B9BD5" w:sz="18" w:space="8"/>
+        </w:pBdr>
+        <w:shd w:fill="EAF2FB" w:color="auto" w:val="clear"/>
+        <w:spacing w:after="120" w:before="60"/>
+        <w:ind w:left="160" w:right="160"/>
+      </w:pPr>
+      <w:r>
+        <w:rPr>
+          <w:b/>
+          <w:bCs/>
+          <w:color w:val="5B9BD5"/>
+        </w:rPr>
+        <w:t xml:space="preserve">建议：</w:t>
+      </w:r>
+      <w:r>
+        <w:t xml:space="preserve">配一张数据流图。</w:t>
+      </w:r>
+    </w:p>
+    <w:p>
+      <w:pPr>
+        <w:pStyle w:val="Heading1"/>
+      </w:pPr>
+      <w:r>
+        <w:t xml:space="preserve">4 From Baseline Analysis to ARK-V2</w:t>
+      </w:r>
+    </w:p>
+    <w:p>
+      <w:pPr>
+        <w:spacing w:after="100"/>
+      </w:pPr>
+      <w:r>
+        <w:t xml:space="preserve">本章是“失败分析 → 需求 → V2 组件”这条主线所在的章：4.1 交代基线，4.2 诊断它的失败并推出需求，4.3 据此设计 ARK-V2。</w:t>
+      </w:r>
+    </w:p>
+    <w:p>
+      <w:pPr>
+        <w:pStyle w:val="Heading2"/>
+      </w:pPr>
+      <w:r>
+        <w:t xml:space="preserve">4.1 Baseline Agent</w:t>
+      </w:r>
+    </w:p>
+    <w:p>
+      <w:pPr>
+        <w:spacing w:after="80" w:before="160"/>
+      </w:pPr>
+      <w:r>
+        <w:rPr>
+          <w:b/>
+          <w:bCs/>
+          <w:color w:val="2E2E2E"/>
+          <w:sz w:val="22"/>
+          <w:szCs w:val="22"/>
+        </w:rPr>
+        <w:t xml:space="preserve">ARK-V1 的工作流程</w:t>
+      </w:r>
+    </w:p>
+    <w:p>
+      <w:pPr>
+        <w:spacing w:after="100"/>
+      </w:pPr>
+      <w:r>
+        <w:t xml:space="preserve">介绍 ARK-V1 的 LangGraph 节点流程（select_anchor → select_relation → reasoning → cleanup → generate_answer）、状态结构和终止条件。</w:t>
+      </w:r>
+    </w:p>
+    <w:p>
+      <w:pPr>
+        <w:pBdr>
+          <w:left w:val="single" w:color="5B9BD5" w:sz="18" w:space="8"/>
+        </w:pBdr>
+        <w:shd w:fill="EAF2FB" w:color="auto" w:val="clear"/>
+        <w:spacing w:after="120" w:before="60"/>
+        <w:ind w:left="160" w:right="160"/>
+      </w:pPr>
+      <w:r>
+        <w:rPr>
+          <w:b/>
+          <w:bCs/>
+          <w:color w:val="5B9BD5"/>
+        </w:rPr>
+        <w:t xml:space="preserve">建议：</w:t>
+      </w:r>
+      <w:r>
+        <w:t xml:space="preserve">配一张流程图，再用一道题演示完整执行过程，最好就用 4.2 会分析的题，后面可以复用。</w:t>
+      </w:r>
+    </w:p>
+    <w:p>
+      <w:pPr>
+        <w:spacing w:after="80" w:before="160"/>
+      </w:pPr>
+      <w:r>
+        <w:rPr>
+          <w:b/>
+          <w:bCs/>
+          <w:color w:val="2E2E2E"/>
+          <w:sz w:val="22"/>
+          <w:szCs w:val="22"/>
+        </w:rPr>
+        <w:t xml:space="preserve">ARK-V1.1 的改动</w:t>
+      </w:r>
+    </w:p>
+    <w:p>
+      <w:pPr>
+        <w:spacing w:after="100"/>
+      </w:pPr>
+      <w:r>
+        <w:t xml:space="preserve">用一张表把 V1.1 的改动按四类列出，每类说明改了什么、为什么必须改：数据/图接口适配、实现正确性修复、输出处理增强、Prompt/行为调整。</w:t>
       </w:r>
     </w:p>
     <w:p>
@@ -898,23 +1459,22 @@
         <w:t xml:space="preserve">注意：</w:t>
       </w:r>
       <w:r>
-        <w:t xml:space="preserve">这一章只描述，不放任何分数，分数都在第 4 章。</w:t>
-      </w:r>
-    </w:p>
-    <w:p>
-      <w:pPr>
-        <w:pStyle w:val="Heading1"/>
-      </w:pPr>
-      <w:r>
-        <w:t xml:space="preserve">3 Evaluation Framework</w:t>
-      </w:r>
-    </w:p>
-    <w:p>
-      <w:pPr>
-        <w:pStyle w:val="Heading2"/>
-      </w:pPr>
-      <w:r>
-        <w:t xml:space="preserve">3.1 From Agent Capabilities to Metrics</w:t>
+        <w:t xml:space="preserve">最后一类必须如实写出来。它改变了 Agent 的行为，所以 V1.1 不能被称为“原版”。</w:t>
+      </w:r>
+    </w:p>
+    <w:p>
+      <w:pPr>
+        <w:spacing w:after="80" w:before="160"/>
+      </w:pPr>
+      <w:r>
+        <w:rPr>
+          <w:b/>
+          <w:bCs/>
+          <w:color w:val="2E2E2E"/>
+          <w:sz w:val="22"/>
+          <w:szCs w:val="22"/>
+        </w:rPr>
+        <w:t xml:space="preserve">冻结基线</w:t>
       </w:r>
     </w:p>
     <w:p>
@@ -922,7 +1482,7 @@
         <w:spacing w:after="100"/>
       </w:pPr>
       <w:r>
-        <w:t xml:space="preserve">用一张表把七个层次对应起来：能力、测试任务、数据需求、标注、日志需求、指标、实现方式。这一节是整个评测设计的总纲。</w:t>
+        <w:t xml:space="preserve">用一两句话说明 V1.1 冻结后不再修改，以保证和 V2 比较时公平。具体配置在 5.1 列出。</w:t>
       </w:r>
     </w:p>
     <w:p>
@@ -943,7 +1503,7 @@
         <w:t xml:space="preserve">注意：</w:t>
       </w:r>
       <w:r>
-        <w:t xml:space="preserve">Problem Understanding 不做定量评价，只通过案例分析，这里要说明理由。</w:t>
+        <w:t xml:space="preserve">这一节只描述，不放任何分数，分数都在 4.2。</w:t>
       </w:r>
     </w:p>
     <w:p>
@@ -951,7 +1511,15 @@
         <w:pStyle w:val="Heading2"/>
       </w:pPr>
       <w:r>
-        <w:t xml:space="preserve">3.2 Evaluation Datasets and Data Split</w:t>
+        <w:t xml:space="preserve">4.2 Baseline Failure Analysis</w:t>
+      </w:r>
+    </w:p>
+    <w:p>
+      <w:pPr>
+        <w:pStyle w:val="Heading3"/>
+      </w:pPr>
+      <w:r>
+        <w:t xml:space="preserve">4.2.1 Preliminary Results</w:t>
       </w:r>
     </w:p>
     <w:p>
@@ -959,54 +1527,7 @@
         <w:spacing w:after="100"/>
       </w:pPr>
       <w:r>
-        <w:t xml:space="preserve">分别介绍三个数据集：</w:t>
-      </w:r>
-    </w:p>
-    <w:p>
-      <w:pPr>
-        <w:pStyle w:val="ListParagraph"/>
-        <w:numPr>
-          <w:ilvl w:val="0"/>
-          <w:numId w:val="2"/>
-        </w:numPr>
-        <w:spacing w:after="60"/>
-      </w:pPr>
-      <w:r>
-        <w:t xml:space="preserve">GTSQA：question-specific graph、gold answer subgraph、图结构类型。</w:t>
-      </w:r>
-    </w:p>
-    <w:p>
-      <w:pPr>
-        <w:pStyle w:val="ListParagraph"/>
-        <w:numPr>
-          <w:ilvl w:val="0"/>
-          <w:numId w:val="2"/>
-        </w:numPr>
-        <w:spacing w:after="60"/>
-      </w:pPr>
-      <w:r>
-        <w:t xml:space="preserve">CR-LT-KGQA：Boolean 答案，KG 证据加常识推理，以及它在本文中的角色。</w:t>
-      </w:r>
-    </w:p>
-    <w:p>
-      <w:pPr>
-        <w:pStyle w:val="ListParagraph"/>
-        <w:numPr>
-          <w:ilvl w:val="0"/>
-          <w:numId w:val="2"/>
-        </w:numPr>
-        <w:spacing w:after="60"/>
-      </w:pPr>
-      <w:r>
-        <w:t xml:space="preserve">GTSQA-UA：在 3.3 详述。</w:t>
-      </w:r>
-    </w:p>
-    <w:p>
-      <w:pPr>
-        <w:spacing w:after="100"/>
-      </w:pPr>
-      <w:r>
-        <w:t xml:space="preserve">然后写开发集和正式测试集怎么划分：正式测试集按图结构类型分层抽样，UA 变体跟着原题放在同一侧。</w:t>
+        <w:t xml:space="preserve">报告 V1.1 在开发集上的结果：12 道 GTSQA、24 项 GTSQA-UA、CR-LT-KGQA 子集。用一句话说明 V1.1 的修改没有扭曲原版在 CR-LT-KGQA 上的表现，详细对比放附录。</w:t>
       </w:r>
     </w:p>
     <w:p>
@@ -1027,15 +1548,15 @@
         <w:t xml:space="preserve">注意：</w:t>
       </w:r>
       <w:r>
-        <w:t xml:space="preserve">开发题来自 GTSQA test split，要主动说明这一点以及隔离措施。</w:t>
-      </w:r>
-    </w:p>
-    <w:p>
-      <w:pPr>
-        <w:pStyle w:val="Heading2"/>
-      </w:pPr>
-      <w:r>
-        <w:t xml:space="preserve">3.3 Construction and Validation of GTSQA-UA</w:t>
+        <w:t xml:space="preserve">统一叫 preliminary / development results，用 x/n 报告，不下泛化结论。</w:t>
+      </w:r>
+    </w:p>
+    <w:p>
+      <w:pPr>
+        <w:pStyle w:val="Heading3"/>
+      </w:pPr>
+      <w:r>
+        <w:t xml:space="preserve">4.2.2 Failure Taxonomy</w:t>
       </w:r>
     </w:p>
     <w:p>
@@ -1043,36 +1564,72 @@
         <w:spacing w:after="100"/>
       </w:pPr>
       <w:r>
-        <w:t xml:space="preserve">写受控事实删除的方法和“不可回答”的操作性定义：原图查询返回 gold 答案，删除事实后同一查询返回空结果。再写验证流程、原题与变体的配对设计，以及局限（依赖 gold SPARQL 的语义正确性）。方法来源 GrailQAbility 的受控删除在这里具体交代。</w:t>
-      </w:r>
-    </w:p>
-    <w:p>
-      <w:pPr>
-        <w:pBdr>
-          <w:left w:val="single" w:color="5B9BD5" w:sz="18" w:space="8"/>
-        </w:pBdr>
-        <w:shd w:fill="EAF2FB" w:color="auto" w:val="clear"/>
-        <w:spacing w:after="120" w:before="60"/>
-        <w:ind w:left="160" w:right="160"/>
-      </w:pPr>
-      <w:r>
-        <w:rPr>
-          <w:b/>
-          <w:bCs/>
-          <w:color w:val="5B9BD5"/>
-        </w:rPr>
-        <w:t xml:space="preserve">建议：</w:t>
-      </w:r>
-      <w:r>
-        <w:t xml:space="preserve">配一个具体例子，展示删除前后的图片段。</w:t>
-      </w:r>
-    </w:p>
-    <w:p>
-      <w:pPr>
-        <w:pStyle w:val="Heading2"/>
-      </w:pPr>
-      <w:r>
-        <w:t xml:space="preserve">3.4 Metrics and Analysis Dimensions</w:t>
+        <w:t xml:space="preserve">用 trace 证据建立失败分类：</w:t>
+      </w:r>
+    </w:p>
+    <w:p>
+      <w:pPr>
+        <w:pStyle w:val="ListParagraph"/>
+        <w:numPr>
+          <w:ilvl w:val="0"/>
+          <w:numId w:val="2"/>
+        </w:numPr>
+        <w:spacing w:after="60"/>
+      </w:pPr>
+      <w:r>
+        <w:t xml:space="preserve">控制流程与状态保留</w:t>
+      </w:r>
+    </w:p>
+    <w:p>
+      <w:pPr>
+        <w:pStyle w:val="ListParagraph"/>
+        <w:numPr>
+          <w:ilvl w:val="0"/>
+          <w:numId w:val="2"/>
+        </w:numPr>
+        <w:spacing w:after="60"/>
+      </w:pPr>
+      <w:r>
+        <w:t xml:space="preserve">必要约束未验证</w:t>
+      </w:r>
+    </w:p>
+    <w:p>
+      <w:pPr>
+        <w:pStyle w:val="ListParagraph"/>
+        <w:numPr>
+          <w:ilvl w:val="0"/>
+          <w:numId w:val="2"/>
+        </w:numPr>
+        <w:spacing w:after="60"/>
+      </w:pPr>
+      <w:r>
+        <w:t xml:space="preserve">关系语义与问题不一致</w:t>
+      </w:r>
+    </w:p>
+    <w:p>
+      <w:pPr>
+        <w:pStyle w:val="ListParagraph"/>
+        <w:numPr>
+          <w:ilvl w:val="0"/>
+          <w:numId w:val="2"/>
+        </w:numPr>
+        <w:spacing w:after="60"/>
+      </w:pPr>
+      <w:r>
+        <w:t xml:space="preserve">证据不足时仍生成答案</w:t>
+      </w:r>
+    </w:p>
+    <w:p>
+      <w:pPr>
+        <w:pStyle w:val="ListParagraph"/>
+        <w:numPr>
+          <w:ilvl w:val="0"/>
+          <w:numId w:val="2"/>
+        </w:numPr>
+        <w:spacing w:after="60"/>
+      </w:pPr>
+      <w:r>
+        <w:t xml:space="preserve">答案名称与实体标识不一致</w:t>
       </w:r>
     </w:p>
     <w:p>
@@ -1080,80 +1637,7 @@
         <w:spacing w:after="100"/>
       </w:pPr>
       <w:r>
-        <w:t xml:space="preserve">逐个给出指标的定义、公式、适用的数据集和解释边界：</w:t>
-      </w:r>
-    </w:p>
-    <w:p>
-      <w:pPr>
-        <w:pStyle w:val="ListParagraph"/>
-        <w:numPr>
-          <w:ilvl w:val="0"/>
-          <w:numId w:val="2"/>
-        </w:numPr>
-        <w:spacing w:after="60"/>
-      </w:pPr>
-      <w:r>
-        <w:t xml:space="preserve">Entity EM、Boolean EM</w:t>
-      </w:r>
-    </w:p>
-    <w:p>
-      <w:pPr>
-        <w:pStyle w:val="ListParagraph"/>
-        <w:numPr>
-          <w:ilvl w:val="0"/>
-          <w:numId w:val="2"/>
-        </w:numPr>
-        <w:spacing w:after="60"/>
-      </w:pPr>
-      <w:r>
-        <w:t xml:space="preserve">Graph Evidence Coverage</w:t>
-      </w:r>
-    </w:p>
-    <w:p>
-      <w:pPr>
-        <w:pStyle w:val="ListParagraph"/>
-        <w:numPr>
-          <w:ilvl w:val="0"/>
-          <w:numId w:val="2"/>
-        </w:numPr>
-        <w:spacing w:after="60"/>
-      </w:pPr>
-      <w:r>
-        <w:t xml:space="preserve">回答/拒答决策准确率、UA 上的幻觉率、原题上的误拒率</w:t>
-      </w:r>
-    </w:p>
-    <w:p>
-      <w:pPr>
-        <w:pStyle w:val="ListParagraph"/>
-        <w:numPr>
-          <w:ilvl w:val="0"/>
-          <w:numId w:val="2"/>
-        </w:numPr>
-        <w:spacing w:after="60"/>
-      </w:pPr>
-      <w:r>
-        <w:t xml:space="preserve">执行失败率</w:t>
-      </w:r>
-    </w:p>
-    <w:p>
-      <w:pPr>
-        <w:pStyle w:val="ListParagraph"/>
-        <w:numPr>
-          <w:ilvl w:val="0"/>
-          <w:numId w:val="2"/>
-        </w:numPr>
-        <w:spacing w:after="60"/>
-      </w:pPr>
-      <w:r>
-        <w:t xml:space="preserve">成本：token、LLM 调用次数、耗时</w:t>
-      </w:r>
-    </w:p>
-    <w:p>
-      <w:pPr>
-        <w:spacing w:after="100"/>
-      </w:pPr>
-      <w:r>
-        <w:t xml:space="preserve">最后说明分析维度用图结构类型，而不是跳数：跳数不等于难度，比如 5 条边的单路径题可能比 2–3 条边的多分支题更简单；而且结构类型是 GTSQA 自带的标注，方便分层抽样。</w:t>
+        <w:t xml:space="preserve">再补充 UA 上的拒答错误类型：错误回答（幻觉）、错误拒答，以及预算耗尽造成的“被动拒答”。每类配 1 个代表案例。</w:t>
       </w:r>
     </w:p>
     <w:p>
@@ -1174,15 +1658,15 @@
         <w:t xml:space="preserve">注意：</w:t>
       </w:r>
       <w:r>
-        <w:t xml:space="preserve">每个指标都要写“它不能证明什么”，见写作注意事项第 3 条。</w:t>
-      </w:r>
-    </w:p>
-    <w:p>
-      <w:pPr>
-        <w:pStyle w:val="Heading2"/>
-      </w:pPr>
-      <w:r>
-        <w:t xml:space="preserve">3.5 Output Contract and Evaluation Pipeline</w:t>
+        <w:t xml:space="preserve">一道题可能同时属于多类，用“题目 × 类别”矩阵展示，不要写成百分比。另外要区分实现层面的问题和方法层面的问题。</w:t>
+      </w:r>
+    </w:p>
+    <w:p>
+      <w:pPr>
+        <w:pStyle w:val="Heading3"/>
+      </w:pPr>
+      <w:r>
+        <w:t xml:space="preserve">4.2.3 Requirements for ARK-V2</w:t>
       </w:r>
     </w:p>
     <w:p>
@@ -1190,52 +1674,7 @@
         <w:spacing w:after="100"/>
       </w:pPr>
       <w:r>
-        <w:t xml:space="preserve">写和具体 Agent 架构无关的输出接口：answer_payload、predicted_answer、answer_status、execution_status、termination_reason。再写端到端数据流：Dataset → Adapter → Agent → Langfuse trace → item/run-level evaluator → 结果导出。还有一个设计：计划运行的样本先登记，失败的样本不会从统计里消失。</w:t>
-      </w:r>
-    </w:p>
-    <w:p>
-      <w:pPr>
-        <w:pBdr>
-          <w:left w:val="single" w:color="5B9BD5" w:sz="18" w:space="8"/>
-        </w:pBdr>
-        <w:shd w:fill="EAF2FB" w:color="auto" w:val="clear"/>
-        <w:spacing w:after="120" w:before="60"/>
-        <w:ind w:left="160" w:right="160"/>
-      </w:pPr>
-      <w:r>
-        <w:rPr>
-          <w:b/>
-          <w:bCs/>
-          <w:color w:val="5B9BD5"/>
-        </w:rPr>
-        <w:t xml:space="preserve">建议：</w:t>
-      </w:r>
-      <w:r>
-        <w:t xml:space="preserve">配一张数据流图。这一节说明了为什么 V1.1 和 V2 能在同一条流程里公平比较。</w:t>
-      </w:r>
-    </w:p>
-    <w:p>
-      <w:pPr>
-        <w:pStyle w:val="Heading1"/>
-      </w:pPr>
-      <w:r>
-        <w:t xml:space="preserve">4 Baseline Evaluation and Failure Analysis</w:t>
-      </w:r>
-    </w:p>
-    <w:p>
-      <w:pPr>
-        <w:pStyle w:val="Heading2"/>
-      </w:pPr>
-      <w:r>
-        <w:t xml:space="preserve">4.1 Preliminary Results</w:t>
-      </w:r>
-    </w:p>
-    <w:p>
-      <w:pPr>
-        <w:spacing w:after="100"/>
-      </w:pPr>
-      <w:r>
-        <w:t xml:space="preserve">报告 V1.1 在开发集上的结果：12 道 GTSQA、24 项 GTSQA-UA、CR-LT-KGQA 子集。另外包括 V1 和 V1.1 在 CR-LT-KGQA 上的对比，用来检查 V1.1 的修改有没有扭曲原版在它本来数据集上的表现。</w:t>
+        <w:t xml:space="preserve">把失败类别转成需求编号 R1…Rn，并写清优先级标准：出现频率、对结果的影响、实现成本、能否通过实验验证。</w:t>
       </w:r>
     </w:p>
     <w:p>
@@ -1256,7 +1695,7 @@
         <w:t xml:space="preserve">注意：</w:t>
       </w:r>
       <w:r>
-        <w:t xml:space="preserve">全章统一叫 preliminary / development results，用 x/n 报告，不下泛化结论。</w:t>
+        <w:t xml:space="preserve">这一节是 V2 取舍的正式依据。以后按时间和难度删减改进项，只要在这里的优先级标准下说得通，就不会显得随意。</w:t>
       </w:r>
     </w:p>
     <w:p>
@@ -1264,7 +1703,7 @@
         <w:pStyle w:val="Heading2"/>
       </w:pPr>
       <w:r>
-        <w:t xml:space="preserve">4.2 Failure Taxonomy</w:t>
+        <w:t xml:space="preserve">4.3 Design of ARK-V2</w:t>
       </w:r>
     </w:p>
     <w:p>
@@ -1272,72 +1711,15 @@
         <w:spacing w:after="100"/>
       </w:pPr>
       <w:r>
-        <w:t xml:space="preserve">用 trace 证据建立失败分类：</w:t>
-      </w:r>
-    </w:p>
-    <w:p>
-      <w:pPr>
-        <w:pStyle w:val="ListParagraph"/>
-        <w:numPr>
-          <w:ilvl w:val="0"/>
-          <w:numId w:val="2"/>
-        </w:numPr>
-        <w:spacing w:after="60"/>
-      </w:pPr>
-      <w:r>
-        <w:t xml:space="preserve">控制流程与状态保留</w:t>
-      </w:r>
-    </w:p>
-    <w:p>
-      <w:pPr>
-        <w:pStyle w:val="ListParagraph"/>
-        <w:numPr>
-          <w:ilvl w:val="0"/>
-          <w:numId w:val="2"/>
-        </w:numPr>
-        <w:spacing w:after="60"/>
-      </w:pPr>
-      <w:r>
-        <w:t xml:space="preserve">必要约束未验证</w:t>
-      </w:r>
-    </w:p>
-    <w:p>
-      <w:pPr>
-        <w:pStyle w:val="ListParagraph"/>
-        <w:numPr>
-          <w:ilvl w:val="0"/>
-          <w:numId w:val="2"/>
-        </w:numPr>
-        <w:spacing w:after="60"/>
-      </w:pPr>
-      <w:r>
-        <w:t xml:space="preserve">关系语义与问题不一致</w:t>
-      </w:r>
-    </w:p>
-    <w:p>
-      <w:pPr>
-        <w:pStyle w:val="ListParagraph"/>
-        <w:numPr>
-          <w:ilvl w:val="0"/>
-          <w:numId w:val="2"/>
-        </w:numPr>
-        <w:spacing w:after="60"/>
-      </w:pPr>
-      <w:r>
-        <w:t xml:space="preserve">证据不足时仍生成答案</w:t>
-      </w:r>
-    </w:p>
-    <w:p>
-      <w:pPr>
-        <w:pStyle w:val="ListParagraph"/>
-        <w:numPr>
-          <w:ilvl w:val="0"/>
-          <w:numId w:val="2"/>
-        </w:numPr>
-        <w:spacing w:after="60"/>
-      </w:pPr>
-      <w:r>
-        <w:t xml:space="preserve">答案名称与实体标识不一致</w:t>
+        <w:t xml:space="preserve">4.3.2–4.3.4 每个组件的写法一致：设计动机（引用 4.2 的失败案例）→ 机制 → 借鉴的方法（在这里具体展开）→ 和 V1 的区别 → 状态和日志的变化。</w:t>
+      </w:r>
+    </w:p>
+    <w:p>
+      <w:pPr>
+        <w:pStyle w:val="Heading3"/>
+      </w:pPr>
+      <w:r>
+        <w:t xml:space="preserve">4.3.1 Overview</w:t>
       </w:r>
     </w:p>
     <w:p>
@@ -1345,7 +1727,55 @@
         <w:spacing w:after="100"/>
       </w:pPr>
       <w:r>
-        <w:t xml:space="preserve">再补充 UA 上的拒答错误类型：错误回答（幻觉）、错误拒答，以及预算耗尽造成的“被动拒答”。每类配 1 个代表案例。</w:t>
+        <w:t xml:space="preserve">从 R1…Rn 引出 V2 的整体架构，配一张和 V1 对比的流程图，再用一张表把需求、V2 组件和解决的失败类别对应起来。</w:t>
+      </w:r>
+    </w:p>
+    <w:p>
+      <w:pPr>
+        <w:pStyle w:val="Heading3"/>
+      </w:pPr>
+      <w:r>
+        <w:t xml:space="preserve">4.3.2 Constraint Representation</w:t>
+      </w:r>
+    </w:p>
+    <w:p>
+      <w:pPr>
+        <w:spacing w:after="100"/>
+      </w:pPr>
+      <w:r>
+        <w:t xml:space="preserve">问题分析与约束表示：把问题里必须满足的约束显式表示出来，供探索和回答前验证使用。</w:t>
+      </w:r>
+    </w:p>
+    <w:p>
+      <w:pPr>
+        <w:pStyle w:val="Heading3"/>
+      </w:pPr>
+      <w:r>
+        <w:t xml:space="preserve">4.3.3 Evidence Retention</w:t>
+      </w:r>
+    </w:p>
+    <w:p>
+      <w:pPr>
+        <w:spacing w:after="100"/>
+      </w:pPr>
+      <w:r>
+        <w:t xml:space="preserve">探索状态与证据保留：在多步探索中保留已经找到的证据和探索状态，避免后续步骤丢失。</w:t>
+      </w:r>
+    </w:p>
+    <w:p>
+      <w:pPr>
+        <w:pStyle w:val="Heading3"/>
+      </w:pPr>
+      <w:r>
+        <w:t xml:space="preserve">4.3.4 Answer Verification</w:t>
+      </w:r>
+    </w:p>
+    <w:p>
+      <w:pPr>
+        <w:spacing w:after="100"/>
+      </w:pPr>
+      <w:r>
+        <w:t xml:space="preserve">回答前验证、知识使用策略与答案绑定：生成答案前检查证据是否充分、是否允许使用参数知识，并把答案绑定到 KG 中的实体标识。</w:t>
       </w:r>
     </w:p>
     <w:p>
@@ -1366,15 +1796,15 @@
         <w:t xml:space="preserve">注意：</w:t>
       </w:r>
       <w:r>
-        <w:t xml:space="preserve">一道题可能同时属于多类，用“题目 × 类别”矩阵展示，不要写成百分比。另外要区分实现层面的问题和方法层面的问题。</w:t>
-      </w:r>
-    </w:p>
-    <w:p>
-      <w:pPr>
-        <w:pStyle w:val="Heading2"/>
-      </w:pPr>
-      <w:r>
-        <w:t xml:space="preserve">4.3 Derived Requirements for ARK-V2</w:t>
+        <w:t xml:space="preserve">这三个组件目前都是候选。最终只写真正实现并且参与了实验的组件，标题等实现后再定。</w:t>
+      </w:r>
+    </w:p>
+    <w:p>
+      <w:pPr>
+        <w:pStyle w:val="Heading3"/>
+      </w:pPr>
+      <w:r>
+        <w:t xml:space="preserve">4.3.5 Implementation</w:t>
       </w:r>
     </w:p>
     <w:p>
@@ -1382,7 +1812,7 @@
         <w:spacing w:after="100"/>
       </w:pPr>
       <w:r>
-        <w:t xml:space="preserve">把失败类别转成需求编号 R1…Rn，并写清优先级标准：出现频率、对结果的影响、实现成本、能否通过实验验证。</w:t>
+        <w:t xml:space="preserve">写 LangGraph 实现，用一两段介绍 LangGraph 即可。再写复用了 V1 的哪些部分（图接口、模型调用封装），以及如何接入 3.5 的统一输出接口和评测流程。</w:t>
       </w:r>
     </w:p>
     <w:p>
@@ -1403,7 +1833,7 @@
         <w:t xml:space="preserve">注意：</w:t>
       </w:r>
       <w:r>
-        <w:t xml:space="preserve">这一节是 V2 取舍的正式依据。以后按时间和难度删减改进项，只要在这里的优先级标准下说得通，就不会显得随意。</w:t>
+        <w:t xml:space="preserve">不要逐个函数讲代码，重点讲状态模型和节点之间的控制流。</w:t>
       </w:r>
     </w:p>
     <w:p>
@@ -1411,7 +1841,7 @@
         <w:pStyle w:val="Heading1"/>
       </w:pPr>
       <w:r>
-        <w:t xml:space="preserve">5 Design and Implementation of ARK-V2</w:t>
+        <w:t xml:space="preserve">5 Evaluation and Discussion</w:t>
       </w:r>
     </w:p>
     <w:p>
@@ -1419,7 +1849,7 @@
         <w:pStyle w:val="Heading2"/>
       </w:pPr>
       <w:r>
-        <w:t xml:space="preserve">5.1 Design Overview</w:t>
+        <w:t xml:space="preserve">5.1 Experimental Protocol</w:t>
       </w:r>
     </w:p>
     <w:p>
@@ -1427,7 +1857,80 @@
         <w:spacing w:after="100"/>
       </w:pPr>
       <w:r>
-        <w:t xml:space="preserve">从 R1…Rn 引出 V2 的整体架构，配一张和 V1 对比的流程图，再用一张表把需求、V2 组件和解决的失败类别对应起来。</w:t>
+        <w:t xml:space="preserve">写清实验条件：</w:t>
+      </w:r>
+    </w:p>
+    <w:p>
+      <w:pPr>
+        <w:pStyle w:val="ListParagraph"/>
+        <w:numPr>
+          <w:ilvl w:val="0"/>
+          <w:numId w:val="2"/>
+        </w:numPr>
+        <w:spacing w:after="60"/>
+      </w:pPr>
+      <w:r>
+        <w:t xml:space="preserve">比较对象是 V1.1 和 V2。</w:t>
+      </w:r>
+    </w:p>
+    <w:p>
+      <w:pPr>
+        <w:pStyle w:val="ListParagraph"/>
+        <w:numPr>
+          <w:ilvl w:val="0"/>
+          <w:numId w:val="2"/>
+        </w:numPr>
+        <w:spacing w:after="60"/>
+      </w:pPr>
+      <w:r>
+        <w:t xml:space="preserve">使用正式测试集。</w:t>
+      </w:r>
+    </w:p>
+    <w:p>
+      <w:pPr>
+        <w:pStyle w:val="ListParagraph"/>
+        <w:numPr>
+          <w:ilvl w:val="0"/>
+          <w:numId w:val="2"/>
+        </w:numPr>
+        <w:spacing w:after="60"/>
+      </w:pPr>
+      <w:r>
+        <w:t xml:space="preserve">统一的条件：模型、温度、探索与重试预算、答案规范化和 QID 补全规则。</w:t>
+      </w:r>
+    </w:p>
+    <w:p>
+      <w:pPr>
+        <w:pStyle w:val="ListParagraph"/>
+        <w:numPr>
+          <w:ilvl w:val="0"/>
+          <w:numId w:val="2"/>
+        </w:numPr>
+        <w:spacing w:after="60"/>
+      </w:pPr>
+      <w:r>
+        <w:t xml:space="preserve">冻结基线的代码提交和 Prompt 版本；完整配置表放附录。</w:t>
+      </w:r>
+    </w:p>
+    <w:p>
+      <w:pPr>
+        <w:pStyle w:val="ListParagraph"/>
+        <w:numPr>
+          <w:ilvl w:val="0"/>
+          <w:numId w:val="2"/>
+        </w:numPr>
+        <w:spacing w:after="60"/>
+      </w:pPr>
+      <w:r>
+        <w:t xml:space="preserve">重复运行次数。</w:t>
+      </w:r>
+    </w:p>
+    <w:p>
+      <w:pPr>
+        <w:spacing w:after="100"/>
+      </w:pPr>
+      <w:r>
+        <w:t xml:space="preserve">如果 CR-LT-KGQA 上两个版本的知识使用规则不一样，要在这里说明。</w:t>
       </w:r>
     </w:p>
     <w:p>
@@ -1435,54 +1938,53 @@
         <w:pStyle w:val="Heading2"/>
       </w:pPr>
       <w:r>
-        <w:t xml:space="preserve">5.2–5.x 每个改进组件各写一节</w:t>
-      </w:r>
-    </w:p>
-    <w:p>
-      <w:pPr>
-        <w:spacing w:after="100"/>
-      </w:pPr>
-      <w:r>
-        <w:t xml:space="preserve">每节的写法一致：设计动机（引用第 4 章的失败案例）→ 机制 → 借鉴的方法（在这里具体展开）→ 和 V1 的区别 → 状态和日志的变化。目前候选组件有：</w:t>
-      </w:r>
-    </w:p>
-    <w:p>
-      <w:pPr>
-        <w:pStyle w:val="ListParagraph"/>
-        <w:numPr>
-          <w:ilvl w:val="0"/>
-          <w:numId w:val="2"/>
-        </w:numPr>
-        <w:spacing w:after="60"/>
-      </w:pPr>
-      <w:r>
-        <w:t xml:space="preserve">问题分析与约束表示</w:t>
-      </w:r>
-    </w:p>
-    <w:p>
-      <w:pPr>
-        <w:pStyle w:val="ListParagraph"/>
-        <w:numPr>
-          <w:ilvl w:val="0"/>
-          <w:numId w:val="2"/>
-        </w:numPr>
-        <w:spacing w:after="60"/>
-      </w:pPr>
-      <w:r>
-        <w:t xml:space="preserve">探索状态与证据保留</w:t>
-      </w:r>
-    </w:p>
-    <w:p>
-      <w:pPr>
-        <w:pStyle w:val="ListParagraph"/>
-        <w:numPr>
-          <w:ilvl w:val="0"/>
-          <w:numId w:val="2"/>
-        </w:numPr>
-        <w:spacing w:after="60"/>
-      </w:pPr>
-      <w:r>
-        <w:t xml:space="preserve">回答前验证、知识使用策略与答案绑定</w:t>
+        <w:t xml:space="preserve">5.2 Answer Correctness and Graph Evidence</w:t>
+      </w:r>
+    </w:p>
+    <w:p>
+      <w:pPr>
+        <w:pStyle w:val="ListParagraph"/>
+        <w:numPr>
+          <w:ilvl w:val="0"/>
+          <w:numId w:val="2"/>
+        </w:numPr>
+        <w:spacing w:after="60"/>
+      </w:pPr>
+      <w:r>
+        <w:t xml:space="preserve">报告总体结果和按图结构类型的结果，每格写 n。</w:t>
+      </w:r>
+    </w:p>
+    <w:p>
+      <w:pPr>
+        <w:pStyle w:val="ListParagraph"/>
+        <w:numPr>
+          <w:ilvl w:val="0"/>
+          <w:numId w:val="2"/>
+        </w:numPr>
+        <w:spacing w:after="60"/>
+      </w:pPr>
+      <w:r>
+        <w:t xml:space="preserve">报告证据覆盖率，以及覆盖率和答案正确性之间的关系，比如“答对但证据覆盖率低”的题有多少。</w:t>
+      </w:r>
+    </w:p>
+    <w:p>
+      <w:pPr>
+        <w:pStyle w:val="ListParagraph"/>
+        <w:numPr>
+          <w:ilvl w:val="0"/>
+          <w:numId w:val="2"/>
+        </w:numPr>
+        <w:spacing w:after="60"/>
+      </w:pPr>
+      <w:r>
+        <w:rPr>
+          <w:b/>
+          <w:bCs/>
+        </w:rPr>
+        <w:t xml:space="preserve">案例分析：</w:t>
+      </w:r>
+      <w:r>
+        <w:t xml:space="preserve">回到 4.2.2 的失败类别，看 V2 解决了哪些、没解决哪些、有没有带来新的失败模式。</w:t>
       </w:r>
     </w:p>
     <w:p>
@@ -1503,7 +2005,7 @@
         <w:t xml:space="preserve">注意：</w:t>
       </w:r>
       <w:r>
-        <w:t xml:space="preserve">最终只写真正实现并且参与了实验的组件。</w:t>
+        <w:t xml:space="preserve">案例分析决定了改进能不能解释清楚，必须用 trace 证据，不能只靠分数推断。</w:t>
       </w:r>
     </w:p>
     <w:p>
@@ -1511,7 +2013,48 @@
         <w:pStyle w:val="Heading2"/>
       </w:pPr>
       <w:r>
-        <w:t xml:space="preserve">5.y Implementation</w:t>
+        <w:t xml:space="preserve">5.3 Refusal Behavior</w:t>
+      </w:r>
+    </w:p>
+    <w:p>
+      <w:pPr>
+        <w:pStyle w:val="ListParagraph"/>
+        <w:numPr>
+          <w:ilvl w:val="0"/>
+          <w:numId w:val="2"/>
+        </w:numPr>
+        <w:spacing w:after="60"/>
+      </w:pPr>
+      <w:r>
+        <w:t xml:space="preserve">重点做配对分析：同一道题在原题和 UA 变体上分别怎么表现。区分四种情况：正确拒答、幻觉、误拒，以及执行失败或预算耗尽。</w:t>
+      </w:r>
+    </w:p>
+    <w:p>
+      <w:pPr>
+        <w:pStyle w:val="ListParagraph"/>
+        <w:numPr>
+          <w:ilvl w:val="0"/>
+          <w:numId w:val="2"/>
+        </w:numPr>
+        <w:spacing w:after="60"/>
+      </w:pPr>
+      <w:r>
+        <w:rPr>
+          <w:b/>
+          <w:bCs/>
+        </w:rPr>
+        <w:t xml:space="preserve">案例分析：</w:t>
+      </w:r>
+      <w:r>
+        <w:t xml:space="preserve">回到 4.2.2 中 UA 上的拒答错误类型（幻觉、误拒、被动拒答），看 V2 改善了哪些，同样用 trace 证据。</w:t>
+      </w:r>
+    </w:p>
+    <w:p>
+      <w:pPr>
+        <w:pStyle w:val="Heading2"/>
+      </w:pPr>
+      <w:r>
+        <w:t xml:space="preserve">5.4 Efficiency</w:t>
       </w:r>
     </w:p>
     <w:p>
@@ -1519,7 +2062,71 @@
         <w:spacing w:after="100"/>
       </w:pPr>
       <w:r>
-        <w:t xml:space="preserve">写 LangGraph 实现，用一两段介绍 LangGraph 即可。再写复用了 V1 的哪些部分（图接口、模型调用封装），以及如何接入第 3 章的输出接口和 Langfuse。</w:t>
+        <w:t xml:space="preserve">报告 token、调用次数和耗时的变化，讨论准确率提升和成本增加之间的权衡。</w:t>
+      </w:r>
+    </w:p>
+    <w:p>
+      <w:pPr>
+        <w:pStyle w:val="Heading2"/>
+      </w:pPr>
+      <w:r>
+        <w:t xml:space="preserve">5.5 Limitations</w:t>
+      </w:r>
+    </w:p>
+    <w:p>
+      <w:pPr>
+        <w:spacing w:after="100"/>
+      </w:pPr>
+      <w:r>
+        <w:t xml:space="preserve">写样本规模、单一模型、LLM 输出的随机性、UA 构造依赖 gold query、指标只是代理指标、开发集与测试集的分布差异。</w:t>
+      </w:r>
+    </w:p>
+    <w:p>
+      <w:pPr>
+        <w:spacing w:after="100"/>
+      </w:pPr>
+      <w:r>
+        <w:t xml:space="preserve">再讨论结果在多大程度上能推广到目标工业图谱（RDF/OWL）。</w:t>
+      </w:r>
+    </w:p>
+    <w:p>
+      <w:pPr>
+        <w:pStyle w:val="Heading1"/>
+      </w:pPr>
+      <w:r>
+        <w:t xml:space="preserve">6 Conclusion</w:t>
+      </w:r>
+    </w:p>
+    <w:p>
+      <w:pPr>
+        <w:pStyle w:val="Heading2"/>
+      </w:pPr>
+      <w:r>
+        <w:t xml:space="preserve">6.1 Answers to the Research Questions</w:t>
+      </w:r>
+    </w:p>
+    <w:p>
+      <w:pPr>
+        <w:spacing w:after="100"/>
+      </w:pPr>
+      <w:r>
+        <w:t xml:space="preserve">每个 RQ 用一段话给出结论，依据第 3–5 章的结果。</w:t>
+      </w:r>
+    </w:p>
+    <w:p>
+      <w:pPr>
+        <w:pStyle w:val="Heading2"/>
+      </w:pPr>
+      <w:r>
+        <w:t xml:space="preserve">6.2 Contributions</w:t>
+      </w:r>
+    </w:p>
+    <w:p>
+      <w:pPr>
+        <w:spacing w:after="100"/>
+      </w:pPr>
+      <w:r>
+        <w:t xml:space="preserve">列出 3 条左右贡献：评测框架（包括 GTSQA-UA 的构造）、失败模式分析、ARK-V2 的设计与评测。每条贡献都要能对应到前文的具体章节和结果。</w:t>
       </w:r>
     </w:p>
     <w:p>
@@ -1540,7 +2147,7 @@
         <w:t xml:space="preserve">注意：</w:t>
       </w:r>
       <w:r>
-        <w:t xml:space="preserve">不要逐个函数讲代码，重点讲状态模型和节点之间的控制流。</w:t>
+        <w:t xml:space="preserve">V1.1 的适配工作不写成贡献。</w:t>
       </w:r>
     </w:p>
     <w:p>
@@ -1548,15 +2155,7 @@
         <w:pStyle w:val="Heading1"/>
       </w:pPr>
       <w:r>
-        <w:t xml:space="preserve">6 Evaluation and Discussion</w:t>
-      </w:r>
-    </w:p>
-    <w:p>
-      <w:pPr>
-        <w:pStyle w:val="Heading2"/>
-      </w:pPr>
-      <w:r>
-        <w:t xml:space="preserve">6.1 Experimental Protocol</w:t>
+        <w:t xml:space="preserve">7 Future Work</w:t>
       </w:r>
     </w:p>
     <w:p>
@@ -1564,147 +2163,7 @@
         <w:spacing w:after="100"/>
       </w:pPr>
       <w:r>
-        <w:t xml:space="preserve">写清实验条件：</w:t>
-      </w:r>
-    </w:p>
-    <w:p>
-      <w:pPr>
-        <w:pStyle w:val="ListParagraph"/>
-        <w:numPr>
-          <w:ilvl w:val="0"/>
-          <w:numId w:val="2"/>
-        </w:numPr>
-        <w:spacing w:after="60"/>
-      </w:pPr>
-      <w:r>
-        <w:t xml:space="preserve">比较对象是 V1.1 和 V2。</w:t>
-      </w:r>
-    </w:p>
-    <w:p>
-      <w:pPr>
-        <w:pStyle w:val="ListParagraph"/>
-        <w:numPr>
-          <w:ilvl w:val="0"/>
-          <w:numId w:val="2"/>
-        </w:numPr>
-        <w:spacing w:after="60"/>
-      </w:pPr>
-      <w:r>
-        <w:t xml:space="preserve">使用正式测试集。</w:t>
-      </w:r>
-    </w:p>
-    <w:p>
-      <w:pPr>
-        <w:pStyle w:val="ListParagraph"/>
-        <w:numPr>
-          <w:ilvl w:val="0"/>
-          <w:numId w:val="2"/>
-        </w:numPr>
-        <w:spacing w:after="60"/>
-      </w:pPr>
-      <w:r>
-        <w:t xml:space="preserve">统一的条件：模型、温度、探索与重试预算、答案规范化和 QID 补全规则。</w:t>
-      </w:r>
-    </w:p>
-    <w:p>
-      <w:pPr>
-        <w:pStyle w:val="ListParagraph"/>
-        <w:numPr>
-          <w:ilvl w:val="0"/>
-          <w:numId w:val="2"/>
-        </w:numPr>
-        <w:spacing w:after="60"/>
-      </w:pPr>
-      <w:r>
-        <w:t xml:space="preserve">重复运行次数。</w:t>
-      </w:r>
-    </w:p>
-    <w:p>
-      <w:pPr>
-        <w:spacing w:after="100"/>
-      </w:pPr>
-      <w:r>
-        <w:t xml:space="preserve">如果 CR-LT-KGQA 上两个版本的知识使用规则不一样，要在这里说明。</w:t>
-      </w:r>
-    </w:p>
-    <w:p>
-      <w:pPr>
-        <w:pStyle w:val="Heading2"/>
-      </w:pPr>
-      <w:r>
-        <w:t xml:space="preserve">6.2 Answer Correctness</w:t>
-      </w:r>
-    </w:p>
-    <w:p>
-      <w:pPr>
-        <w:spacing w:after="100"/>
-      </w:pPr>
-      <w:r>
-        <w:t xml:space="preserve">报告总体结果和按图结构类型的结果，每格写 n。</w:t>
-      </w:r>
-    </w:p>
-    <w:p>
-      <w:pPr>
-        <w:pStyle w:val="Heading2"/>
-      </w:pPr>
-      <w:r>
-        <w:t xml:space="preserve">6.3 Graph Evidence</w:t>
-      </w:r>
-    </w:p>
-    <w:p>
-      <w:pPr>
-        <w:spacing w:after="100"/>
-      </w:pPr>
-      <w:r>
-        <w:t xml:space="preserve">报告证据覆盖率，以及覆盖率和答案正确性之间的关系，比如“答对但证据覆盖率低”的题有多少。</w:t>
-      </w:r>
-    </w:p>
-    <w:p>
-      <w:pPr>
-        <w:pStyle w:val="Heading2"/>
-      </w:pPr>
-      <w:r>
-        <w:t xml:space="preserve">6.4 Answerability and Refusal</w:t>
-      </w:r>
-    </w:p>
-    <w:p>
-      <w:pPr>
-        <w:spacing w:after="100"/>
-      </w:pPr>
-      <w:r>
-        <w:t xml:space="preserve">重点做配对分析：同一道题在原题和 UA 变体上分别怎么表现。区分四种情况：正确拒答、幻觉、误拒，以及执行失败或预算耗尽。</w:t>
-      </w:r>
-    </w:p>
-    <w:p>
-      <w:pPr>
-        <w:pStyle w:val="Heading2"/>
-      </w:pPr>
-      <w:r>
-        <w:t xml:space="preserve">6.5 Cost and Efficiency</w:t>
-      </w:r>
-    </w:p>
-    <w:p>
-      <w:pPr>
-        <w:spacing w:after="100"/>
-      </w:pPr>
-      <w:r>
-        <w:t xml:space="preserve">报告 token、调用次数和耗时的变化，讨论准确率提升和成本增加之间的权衡。</w:t>
-      </w:r>
-    </w:p>
-    <w:p>
-      <w:pPr>
-        <w:pStyle w:val="Heading2"/>
-      </w:pPr>
-      <w:r>
-        <w:t xml:space="preserve">6.6 Failure Case Analysis</w:t>
-      </w:r>
-    </w:p>
-    <w:p>
-      <w:pPr>
-        <w:spacing w:after="100"/>
-      </w:pPr>
-      <w:r>
-        <w:t xml:space="preserve">回到第 4 章的失败类别，看 V2 解决了哪些、没解决哪些、有没有带来新的失败模式。</w:t>
+        <w:t xml:space="preserve">从 5.5 的局限出发提出后续方向，并回到 1.1 的应用场景。</w:t>
       </w:r>
     </w:p>
     <w:p>
@@ -1725,39 +2184,7 @@
         <w:t xml:space="preserve">注意：</w:t>
       </w:r>
       <w:r>
-        <w:t xml:space="preserve">这一节决定了改进能不能解释清楚，必须用 trace 证据，不能只靠分数推断。</w:t>
-      </w:r>
-    </w:p>
-    <w:p>
-      <w:pPr>
-        <w:pStyle w:val="Heading2"/>
-      </w:pPr>
-      <w:r>
-        <w:t xml:space="preserve">6.7 Discussion</w:t>
-      </w:r>
-    </w:p>
-    <w:p>
-      <w:pPr>
-        <w:spacing w:after="100"/>
-      </w:pPr>
-      <w:r>
-        <w:t xml:space="preserve">逐条回答 RQ，讨论结果在多大程度上能推广到目标工业图谱（RDF/OWL）。</w:t>
-      </w:r>
-    </w:p>
-    <w:p>
-      <w:pPr>
-        <w:pStyle w:val="Heading2"/>
-      </w:pPr>
-      <w:r>
-        <w:t xml:space="preserve">6.8 Limitations and Threats to Validity</w:t>
-      </w:r>
-    </w:p>
-    <w:p>
-      <w:pPr>
-        <w:spacing w:after="100"/>
-      </w:pPr>
-      <w:r>
-        <w:t xml:space="preserve">写样本规模、单一模型、LLM 输出的随机性、UA 构造依赖 gold query、指标只是代理指标、开发集与测试集的分布差异。</w:t>
+        <w:t xml:space="preserve">只基于论文里已经暴露的问题，不新增章节里没出现过的工作。</w:t>
       </w:r>
     </w:p>
     <w:p>
@@ -1765,39 +2192,33 @@
         <w:pStyle w:val="Heading1"/>
       </w:pPr>
       <w:r>
-        <w:t xml:space="preserve">7 Conclusion and Outlook</w:t>
-      </w:r>
-    </w:p>
-    <w:p>
-      <w:pPr>
-        <w:pStyle w:val="Heading2"/>
-      </w:pPr>
-      <w:r>
-        <w:t xml:space="preserve">7.1 Summary and Answers to the Research Questions</w:t>
-      </w:r>
-    </w:p>
-    <w:p>
-      <w:pPr>
-        <w:spacing w:after="100"/>
-      </w:pPr>
-      <w:r>
-        <w:t xml:space="preserve">每个 RQ 用一段话给出结论。</w:t>
-      </w:r>
-    </w:p>
-    <w:p>
-      <w:pPr>
-        <w:pStyle w:val="Heading2"/>
-      </w:pPr>
-      <w:r>
-        <w:t xml:space="preserve">7.2 Contributions</w:t>
-      </w:r>
-    </w:p>
-    <w:p>
-      <w:pPr>
-        <w:spacing w:after="100"/>
-      </w:pPr>
-      <w:r>
-        <w:t xml:space="preserve">列出 3 条左右贡献：评测框架（包括 GTSQA-UA 的构造）、失败模式分析、ARK-V2 的设计与评测。每条贡献都要能对应到前文的具体章节和结果。</w:t>
+        <w:t xml:space="preserve">References（不编号）</w:t>
+      </w:r>
+    </w:p>
+    <w:p>
+      <w:pPr>
+        <w:pStyle w:val="ListParagraph"/>
+        <w:numPr>
+          <w:ilvl w:val="0"/>
+          <w:numId w:val="2"/>
+        </w:numPr>
+        <w:spacing w:after="60"/>
+      </w:pPr>
+      <w:r>
+        <w:t xml:space="preserve">按 IFL 的 Chicago 改编版：正文用作者-年份-页码，例如 (Müller 1997, p. 45)；间接引用不加 “cf.”/“vgl.”；超过三位作者时正文只写第一作者加 et al.（德文论文用 u. a.），参考文献列出全部作者。</w:t>
+      </w:r>
+    </w:p>
+    <w:p>
+      <w:pPr>
+        <w:pStyle w:val="ListParagraph"/>
+        <w:numPr>
+          <w:ilvl w:val="0"/>
+          <w:numId w:val="2"/>
+        </w:numPr>
+        <w:spacing w:after="60"/>
+      </w:pPr>
+      <w:r>
+        <w:t xml:space="preserve">网络来源写完整 URL 和访问日期；重要的网络来源（如数据集页面、代码仓库）存档后放进附录。</w:t>
       </w:r>
     </w:p>
     <w:p>
@@ -1818,15 +2239,15 @@
         <w:t xml:space="preserve">注意：</w:t>
       </w:r>
       <w:r>
-        <w:t xml:space="preserve">V1.1 的适配工作不写成贡献。</w:t>
-      </w:r>
-    </w:p>
-    <w:p>
-      <w:pPr>
-        <w:pStyle w:val="Heading2"/>
-      </w:pPr>
-      <w:r>
-        <w:t xml:space="preserve">7.3 Outlook</w:t>
+        <w:t xml:space="preserve">「标注他人内容」是排除项：ARK-V1 的流程图和描述、数据集、借鉴的方法、改编的图都要标明来源，改画的图写 “adapted from”。</w:t>
+      </w:r>
+    </w:p>
+    <w:p>
+      <w:pPr>
+        <w:pStyle w:val="Heading1"/>
+      </w:pPr>
+      <w:r>
+        <w:t xml:space="preserve">Appendix</w:t>
       </w:r>
     </w:p>
     <w:p>
@@ -1834,43 +2255,6 @@
         <w:spacing w:after="100"/>
       </w:pPr>
       <w:r>
-        <w:t xml:space="preserve">从第 6.8 节的局限出发提出后续方向，并回到引言中的应用场景。</w:t>
-      </w:r>
-    </w:p>
-    <w:p>
-      <w:pPr>
-        <w:pBdr>
-          <w:left w:val="single" w:color="E8A33D" w:sz="18" w:space="8"/>
-        </w:pBdr>
-        <w:shd w:fill="FFF4E5" w:color="auto" w:val="clear"/>
-        <w:spacing w:after="120" w:before="60"/>
-        <w:ind w:left="160" w:right="160"/>
-      </w:pPr>
-      <w:r>
-        <w:rPr>
-          <w:b/>
-          <w:bCs/>
-          <w:color w:val="E8A33D"/>
-        </w:rPr>
-        <w:t xml:space="preserve">注意：</w:t>
-      </w:r>
-      <w:r>
-        <w:t xml:space="preserve">Outlook 只基于论文里已经暴露的问题，不新增章节里没出现过的工作。</w:t>
-      </w:r>
-    </w:p>
-    <w:p>
-      <w:pPr>
-        <w:pStyle w:val="Heading1"/>
-      </w:pPr>
-      <w:r>
-        <w:t xml:space="preserve">Appendix</w:t>
-      </w:r>
-    </w:p>
-    <w:p>
-      <w:pPr>
-        <w:spacing w:after="100"/>
-      </w:pPr>
-      <w:r>
         <w:t xml:space="preserve">建议放入以下内容：</w:t>
       </w:r>
     </w:p>
@@ -1897,7 +2281,20 @@
         <w:spacing w:after="60"/>
       </w:pPr>
       <w:r>
-        <w:t xml:space="preserve">实验配置（代码提交、模型、预算、Langfuse experiment ID）</w:t>
+        <w:t xml:space="preserve">实验配置（冻结基线的代码提交、Prompt 版本、模型、温度、预算、Langfuse experiment ID）</w:t>
+      </w:r>
+    </w:p>
+    <w:p>
+      <w:pPr>
+        <w:pStyle w:val="ListParagraph"/>
+        <w:numPr>
+          <w:ilvl w:val="0"/>
+          <w:numId w:val="2"/>
+        </w:numPr>
+        <w:spacing w:after="60"/>
+      </w:pPr>
+      <w:r>
+        <w:t xml:space="preserve">统一输出接口的字段定义</w:t>
       </w:r>
     </w:p>
     <w:p>
@@ -1923,6 +2320,19 @@
         <w:spacing w:after="60"/>
       </w:pPr>
       <w:r>
+        <w:t xml:space="preserve">V1 与 V1.1 在 CR-LT-KGQA 上的对比</w:t>
+      </w:r>
+    </w:p>
+    <w:p>
+      <w:pPr>
+        <w:pStyle w:val="ListParagraph"/>
+        <w:numPr>
+          <w:ilvl w:val="0"/>
+          <w:numId w:val="2"/>
+        </w:numPr>
+        <w:spacing w:after="60"/>
+      </w:pPr>
+      <w:r>
         <w:t xml:space="preserve">GTSQA-UA 的删除记录</w:t>
       </w:r>
     </w:p>
@@ -1937,6 +2347,19 @@
       </w:pPr>
       <w:r>
         <w:t xml:space="preserve">代码标识与论文名称对照表</w:t>
+      </w:r>
+    </w:p>
+    <w:p>
+      <w:pPr>
+        <w:pStyle w:val="ListParagraph"/>
+        <w:numPr>
+          <w:ilvl w:val="0"/>
+          <w:numId w:val="2"/>
+        </w:numPr>
+        <w:spacing w:after="60"/>
+      </w:pPr>
+      <w:r>
+        <w:t xml:space="preserve">重要网络来源的存档（见参考文献说明）</w:t>
       </w:r>
     </w:p>
     <w:p>
@@ -1971,7 +2394,7 @@
         <w:ind w:left="360"/>
       </w:pPr>
       <w:r>
-        <w:t xml:space="preserve">V2 的每个组件都要能追溯到第 4 章的某个失败类别，并在第 6 章被验证。建议维护一张“失败类别 → 需求 → 组件 → 验证结果”的总表（模板见文末），第 4、5、6 章都引用它。哪个组件对不上这条链，就该考虑删掉。</w:t>
+        <w:t xml:space="preserve">V2 的每个组件都要能追溯到 4.2.2 的某个失败类别，并在第 5 章被验证。建议维护一张“失败类别 → 需求 → 组件 → 验证结果”的总表（模板见文末），4.2、4.3 和第 5 章都引用它。哪个组件对不上这条链，就该考虑删掉。</w:t>
       </w:r>
     </w:p>
     <w:p>
@@ -1998,7 +2421,7 @@
         <w:ind w:left="360"/>
       </w:pPr>
       <w:r>
-        <w:t xml:space="preserve">12 道开发题和它们的 UA 变体只能出现在第 4 章，并且明确标注为 development results。第 6 章只用 held-out 题。绝不能把开发集上的提升写成正式结论。</w:t>
+        <w:t xml:space="preserve">12 道开发题和它们的 UA 变体只能出现在 4.2，并且明确标注为 development results。第 5 章只用 held-out 题。绝不能把开发集上的提升写成正式结论。</w:t>
       </w:r>
     </w:p>
     <w:p>
@@ -2079,7 +2502,7 @@
         <w:ind w:left="360"/>
       </w:pPr>
       <w:r>
-        <w:t xml:space="preserve">V2 最终保留哪些改进，由 4.3 节的优先级标准决定。论文里不出现“计划实现”“可以扩展”这类描述，Introduction 的文献综述也只深入写实际借鉴的方法。</w:t>
+        <w:t xml:space="preserve">V2 最终保留哪些改进，由 4.2.3 的优先级标准决定。论文里不出现“计划实现”“可以扩展”这类描述；相关工作（2.2、2.3）也只深入写实际借鉴的方法，但覆盖面要完整。</w:t>
       </w:r>
     </w:p>
     <w:p>
@@ -2133,7 +2556,7 @@
         <w:ind w:left="360"/>
       </w:pPr>
       <w:r>
-        <w:t xml:space="preserve">先论证“跳数不等于复杂度”（比如单路径长链和多分支短图的对比），之后的结果才能按结构类型组织。如果某些结构类型的题明显更难，最好结合第 4 章的失败模式解释原因。</w:t>
+        <w:t xml:space="preserve">先论证“跳数不等于复杂度”（比如单路径长链和多分支短图的对比），之后的结果才能按结构类型组织。如果某些结构类型的题明显更难，最好结合 4.2 的失败模式解释原因。</w:t>
       </w:r>
     </w:p>
     <w:p>
@@ -2160,7 +2583,7 @@
         <w:ind w:left="360"/>
       </w:pPr>
       <w:r>
-        <w:t xml:space="preserve">每个案例都写这几项：题目、gold 答案、预测答案、指标结果、关键 trace 证据（节点名和输出字段）、失败类别。第 4 章和第 6 章用同一套格式，前后才能对照。</w:t>
+        <w:t xml:space="preserve">每个案例都写这几项：题目、gold 答案、预测答案、指标结果、关键 trace 证据（节点名和输出字段）、失败类别。4.2 和第 5 章用同一套格式，前后才能对照。</w:t>
       </w:r>
     </w:p>
     <w:p>
@@ -2241,7 +2664,7 @@
         <w:ind w:left="360"/>
       </w:pPr>
       <w:r>
-        <w:t xml:space="preserve">建议先写第 3 章（评测框架）和第 2 章（基线 Agent），这两章都不依赖 V2；Introduction 中的文献综述可以同步积累。第 4 章等开发集分析定稿再写，第 5、6 章最后写。Introduction 的其余部分、第 7 章和摘要放到最后，那时 RQ 和贡献已经确定。</w:t>
+        <w:t xml:space="preserve">建议先写第 3 章（评测框架）和 4.1（基线 Agent），这两部分都不依赖 V2；第 2 章（背景知识和相关工作）可以同步积累。4.2 等开发集分析定稿再写，4.3 和第 5 章最后写。第 1 章、第 6、7 章和摘要放到最后，那时 RQ 和贡献已经确定。</w:t>
       </w:r>
     </w:p>
     <w:p>
@@ -2259,7 +2682,7 @@
           <w:bCs/>
           <w:color w:val="1F4E79"/>
         </w:rPr>
-        <w:t xml:space="preserve">文献综述每个主题结尾写出该方向的不足。</w:t>
+        <w:t xml:space="preserve">相关工作的每个主题结尾写出不足。</w:t>
       </w:r>
     </w:p>
     <w:p>
@@ -2268,7 +2691,7 @@
         <w:ind w:left="360"/>
       </w:pPr>
       <w:r>
-        <w:t xml:space="preserve">Introduction 里的文献综述按主题组织，每个主题最后用一两句话指出已有研究的不足，这样研究空白和 RQ 才能自然引出，也避免综述写成和本文无关的罗列。</w:t>
+        <w:t xml:space="preserve">相关工作（2.2、2.3）按主题组织，每个主题最后用一两句话指出已有研究的不足，这样 2.4 的研究空白和 RQ 才能自然引出，也避免综述写成和本文无关的罗列。背景知识（2.1）只交代概念，不需要写不足。</w:t>
       </w:r>
     </w:p>
     <w:p>
@@ -2284,7 +2707,7 @@
         <w:spacing w:after="100"/>
       </w:pPr>
       <w:r>
-        <w:t xml:space="preserve">每完成一项分析或实现，就在对应列填写，第 4–6 章都引用这张表。</w:t>
+        <w:t xml:space="preserve">每完成一项分析或实现，就在对应列填写，4.2、4.3 和第 5 章都引用这张表。</w:t>
       </w:r>
     </w:p>
     <w:tbl>
@@ -2332,7 +2755,7 @@
                 <w:b/>
                 <w:bCs/>
               </w:rPr>
-              <w:t xml:space="preserve">失败类别（第 4 章）</w:t>
+              <w:t xml:space="preserve">失败类别（4.2.2）</w:t>
             </w:r>
           </w:p>
         </w:tc>
@@ -2359,7 +2782,7 @@
                 <w:b/>
                 <w:bCs/>
               </w:rPr>
-              <w:t xml:space="preserve">需求编号</w:t>
+              <w:t xml:space="preserve">需求编号（4.2.3）</w:t>
             </w:r>
           </w:p>
         </w:tc>
@@ -2386,7 +2809,7 @@
                 <w:b/>
                 <w:bCs/>
               </w:rPr>
-              <w:t xml:space="preserve">V2 组件（第 5 章）</w:t>
+              <w:t xml:space="preserve">V2 组件（4.3）</w:t>
             </w:r>
           </w:p>
         </w:tc>
@@ -2413,7 +2836,7 @@
                 <w:b/>
                 <w:bCs/>
               </w:rPr>
-              <w:t xml:space="preserve">验证结果（第 6 章）</w:t>
+              <w:t xml:space="preserve">验证结果（第 5 章）</w:t>
             </w:r>
           </w:p>
         </w:tc>

</xml_diff>